<commit_message>
Add meeting time and report items to the September 29 agenda
The record header gives the meeting as 10:00 a.m. to 12:00 p.m. The
associate dean's report and the chair's report open the agenda as
items 01 and 02. Course and program proposals are renumbered 03 and 04.
The MLL 359 title is set in title case to match the other entries.
</commit_message>
<xml_diff>
--- a/committee/ccc/agendas/2026-09-29-agenda.docx
+++ b/committee/ccc/agendas/2026-09-29-agenda.docx
@@ -194,7 +194,7 @@
                 <w:sz w:val="18"/>
                 <w:szCs w:val="18"/>
               </w:rPr>
-              <w:t xml:space="preserve">Tuesday, September 29, 2026</w:t>
+              <w:t xml:space="preserve">Tuesday, September 29, 2026, 10:00 a.m. to 12:00 p.m.</w:t>
             </w:r>
           </w:p>
         </w:tc>
@@ -289,7 +289,7 @@
         </w:rPr>
         <w:t xml:space="preserve">Zoom  </w:t>
       </w:r>
-      <w:hyperlink w:history="1" r:id="rIdhc8lumddueeh3wzdp1bgb">
+      <w:hyperlink w:history="1" r:id="rIdsjrfh7sw6kc3gxeg7o3b4">
         <w:r>
           <w:rPr>
             <w:rFonts w:ascii="Montserrat" w:cs="Montserrat" w:eastAsia="Montserrat" w:hAnsi="Montserrat"/>
@@ -315,7 +315,7 @@
         </w:rPr>
         <w:t xml:space="preserve">Committee page  </w:t>
       </w:r>
-      <w:hyperlink w:history="1" r:id="rIdnxiscuf5d1hjlv-d2pzbf">
+      <w:hyperlink w:history="1" r:id="rId3a5tef5zi0ocx0fm6-dhz">
         <w:r>
           <w:rPr>
             <w:rFonts w:ascii="Montserrat" w:cs="Montserrat" w:eastAsia="Montserrat" w:hAnsi="Montserrat"/>
@@ -331,7 +331,7 @@
     <w:p>
       <w:pPr>
         <w:keepNext/>
-        <w:spacing w:after="160" w:before="360" w:line="336"/>
+        <w:spacing w:after="120" w:before="280" w:line="336"/>
       </w:pPr>
       <w:r>
         <w:rPr>
@@ -343,6 +343,90 @@
           <w:szCs w:val="26"/>
         </w:rPr>
         <w:t xml:space="preserve">01</w:t>
+      </w:r>
+      <w:r>
+        <w:rPr>
+          <w:rFonts w:ascii="Montserrat" w:cs="Montserrat" w:eastAsia="Montserrat" w:hAnsi="Montserrat"/>
+          <w:b/>
+          <w:bCs/>
+          <w:color w:val="000000"/>
+          <w:sz w:val="26"/>
+          <w:szCs w:val="26"/>
+        </w:rPr>
+        <w:t xml:space="preserve">   Associate dean’s report</w:t>
+      </w:r>
+    </w:p>
+    <w:p>
+      <w:pPr>
+        <w:spacing w:after="140" w:before="0" w:line="336"/>
+      </w:pPr>
+      <w:r>
+        <w:rPr>
+          <w:rFonts w:ascii="Roboto Serif" w:cs="Roboto Serif" w:eastAsia="Roboto Serif" w:hAnsi="Roboto Serif"/>
+          <w:color w:val="000000"/>
+          <w:sz w:val="23"/>
+          <w:szCs w:val="23"/>
+        </w:rPr>
+        <w:t xml:space="preserve">Nicholas Baham, Interim Associate Dean</w:t>
+      </w:r>
+    </w:p>
+    <w:p>
+      <w:pPr>
+        <w:keepNext/>
+        <w:spacing w:after="120" w:before="280" w:line="336"/>
+      </w:pPr>
+      <w:r>
+        <w:rPr>
+          <w:rFonts w:ascii="Montserrat" w:cs="Montserrat" w:eastAsia="Montserrat" w:hAnsi="Montserrat"/>
+          <w:b/>
+          <w:bCs/>
+          <w:color w:val="D50032"/>
+          <w:sz w:val="26"/>
+          <w:szCs w:val="26"/>
+        </w:rPr>
+        <w:t xml:space="preserve">02</w:t>
+      </w:r>
+      <w:r>
+        <w:rPr>
+          <w:rFonts w:ascii="Montserrat" w:cs="Montserrat" w:eastAsia="Montserrat" w:hAnsi="Montserrat"/>
+          <w:b/>
+          <w:bCs/>
+          <w:color w:val="000000"/>
+          <w:sz w:val="26"/>
+          <w:szCs w:val="26"/>
+        </w:rPr>
+        <w:t xml:space="preserve">   Chair’s report</w:t>
+      </w:r>
+    </w:p>
+    <w:p>
+      <w:pPr>
+        <w:spacing w:after="140" w:before="0" w:line="336"/>
+      </w:pPr>
+      <w:r>
+        <w:rPr>
+          <w:rFonts w:ascii="Roboto Serif" w:cs="Roboto Serif" w:eastAsia="Roboto Serif" w:hAnsi="Roboto Serif"/>
+          <w:color w:val="000000"/>
+          <w:sz w:val="23"/>
+          <w:szCs w:val="23"/>
+        </w:rPr>
+        <w:t xml:space="preserve">Inés Thiebaut, Chair</w:t>
+      </w:r>
+    </w:p>
+    <w:p>
+      <w:pPr>
+        <w:keepNext/>
+        <w:spacing w:after="120" w:before="280" w:line="336"/>
+      </w:pPr>
+      <w:r>
+        <w:rPr>
+          <w:rFonts w:ascii="Montserrat" w:cs="Montserrat" w:eastAsia="Montserrat" w:hAnsi="Montserrat"/>
+          <w:b/>
+          <w:bCs/>
+          <w:color w:val="D50032"/>
+          <w:sz w:val="26"/>
+          <w:szCs w:val="26"/>
+        </w:rPr>
+        <w:t xml:space="preserve">03</w:t>
       </w:r>
       <w:r>
         <w:rPr>
@@ -403,9 +487,9 @@
               <w:right w:val="none" w:color="FFFFFF" w:sz="0"/>
             </w:tcBorders>
             <w:tcMar>
-              <w:top w:type="dxa" w:w="70"/>
+              <w:top w:type="dxa" w:w="45"/>
               <w:left w:type="dxa" w:w="0"/>
-              <w:bottom w:type="dxa" w:w="70"/>
+              <w:bottom w:type="dxa" w:w="45"/>
               <w:right w:type="dxa" w:w="100"/>
             </w:tcMar>
           </w:tcPr>
@@ -436,9 +520,9 @@
               <w:right w:val="none" w:color="FFFFFF" w:sz="0"/>
             </w:tcBorders>
             <w:tcMar>
-              <w:top w:type="dxa" w:w="70"/>
-              <w:left w:type="dxa" w:w="100"/>
-              <w:bottom w:type="dxa" w:w="70"/>
+              <w:top w:type="dxa" w:w="45"/>
+              <w:left w:type="dxa" w:w="100"/>
+              <w:bottom w:type="dxa" w:w="45"/>
               <w:right w:type="dxa" w:w="100"/>
             </w:tcMar>
           </w:tcPr>
@@ -469,9 +553,9 @@
               <w:right w:val="none" w:color="FFFFFF" w:sz="0"/>
             </w:tcBorders>
             <w:tcMar>
-              <w:top w:type="dxa" w:w="70"/>
-              <w:left w:type="dxa" w:w="100"/>
-              <w:bottom w:type="dxa" w:w="70"/>
+              <w:top w:type="dxa" w:w="45"/>
+              <w:left w:type="dxa" w:w="100"/>
+              <w:bottom w:type="dxa" w:w="45"/>
               <w:right w:type="dxa" w:w="100"/>
             </w:tcMar>
           </w:tcPr>
@@ -502,9 +586,9 @@
               <w:right w:val="none" w:color="FFFFFF" w:sz="0"/>
             </w:tcBorders>
             <w:tcMar>
-              <w:top w:type="dxa" w:w="70"/>
-              <w:left w:type="dxa" w:w="100"/>
-              <w:bottom w:type="dxa" w:w="70"/>
+              <w:top w:type="dxa" w:w="45"/>
+              <w:left w:type="dxa" w:w="100"/>
+              <w:bottom w:type="dxa" w:w="45"/>
               <w:right w:type="dxa" w:w="0"/>
             </w:tcMar>
           </w:tcPr>
@@ -540,9 +624,9 @@
               <w:right w:val="none" w:color="FFFFFF" w:sz="0"/>
             </w:tcBorders>
             <w:tcMar>
-              <w:top w:type="dxa" w:w="70"/>
+              <w:top w:type="dxa" w:w="45"/>
               <w:left w:type="dxa" w:w="0"/>
-              <w:bottom w:type="dxa" w:w="70"/>
+              <w:bottom w:type="dxa" w:w="45"/>
               <w:right w:type="dxa" w:w="100"/>
             </w:tcMar>
           </w:tcPr>
@@ -571,9 +655,9 @@
               <w:right w:val="none" w:color="FFFFFF" w:sz="0"/>
             </w:tcBorders>
             <w:tcMar>
-              <w:top w:type="dxa" w:w="70"/>
-              <w:left w:type="dxa" w:w="100"/>
-              <w:bottom w:type="dxa" w:w="70"/>
+              <w:top w:type="dxa" w:w="45"/>
+              <w:left w:type="dxa" w:w="100"/>
+              <w:bottom w:type="dxa" w:w="45"/>
               <w:right w:type="dxa" w:w="100"/>
             </w:tcMar>
           </w:tcPr>
@@ -604,9 +688,9 @@
               <w:right w:val="none" w:color="FFFFFF" w:sz="0"/>
             </w:tcBorders>
             <w:tcMar>
-              <w:top w:type="dxa" w:w="70"/>
-              <w:left w:type="dxa" w:w="100"/>
-              <w:bottom w:type="dxa" w:w="70"/>
+              <w:top w:type="dxa" w:w="45"/>
+              <w:left w:type="dxa" w:w="100"/>
+              <w:bottom w:type="dxa" w:w="45"/>
               <w:right w:type="dxa" w:w="100"/>
             </w:tcMar>
           </w:tcPr>
@@ -635,9 +719,9 @@
               <w:right w:val="none" w:color="FFFFFF" w:sz="0"/>
             </w:tcBorders>
             <w:tcMar>
-              <w:top w:type="dxa" w:w="70"/>
-              <w:left w:type="dxa" w:w="100"/>
-              <w:bottom w:type="dxa" w:w="70"/>
+              <w:top w:type="dxa" w:w="45"/>
+              <w:left w:type="dxa" w:w="100"/>
+              <w:bottom w:type="dxa" w:w="45"/>
               <w:right w:type="dxa" w:w="0"/>
             </w:tcMar>
           </w:tcPr>
@@ -671,9 +755,9 @@
               <w:right w:val="none" w:color="FFFFFF" w:sz="0"/>
             </w:tcBorders>
             <w:tcMar>
-              <w:top w:type="dxa" w:w="70"/>
+              <w:top w:type="dxa" w:w="45"/>
               <w:left w:type="dxa" w:w="0"/>
-              <w:bottom w:type="dxa" w:w="70"/>
+              <w:bottom w:type="dxa" w:w="45"/>
               <w:right w:type="dxa" w:w="100"/>
             </w:tcMar>
           </w:tcPr>
@@ -702,9 +786,9 @@
               <w:right w:val="none" w:color="FFFFFF" w:sz="0"/>
             </w:tcBorders>
             <w:tcMar>
-              <w:top w:type="dxa" w:w="70"/>
-              <w:left w:type="dxa" w:w="100"/>
-              <w:bottom w:type="dxa" w:w="70"/>
+              <w:top w:type="dxa" w:w="45"/>
+              <w:left w:type="dxa" w:w="100"/>
+              <w:bottom w:type="dxa" w:w="45"/>
               <w:right w:type="dxa" w:w="100"/>
             </w:tcMar>
           </w:tcPr>
@@ -735,9 +819,9 @@
               <w:right w:val="none" w:color="FFFFFF" w:sz="0"/>
             </w:tcBorders>
             <w:tcMar>
-              <w:top w:type="dxa" w:w="70"/>
-              <w:left w:type="dxa" w:w="100"/>
-              <w:bottom w:type="dxa" w:w="70"/>
+              <w:top w:type="dxa" w:w="45"/>
+              <w:left w:type="dxa" w:w="100"/>
+              <w:bottom w:type="dxa" w:w="45"/>
               <w:right w:type="dxa" w:w="100"/>
             </w:tcMar>
           </w:tcPr>
@@ -766,9 +850,9 @@
               <w:right w:val="none" w:color="FFFFFF" w:sz="0"/>
             </w:tcBorders>
             <w:tcMar>
-              <w:top w:type="dxa" w:w="70"/>
-              <w:left w:type="dxa" w:w="100"/>
-              <w:bottom w:type="dxa" w:w="70"/>
+              <w:top w:type="dxa" w:w="45"/>
+              <w:left w:type="dxa" w:w="100"/>
+              <w:bottom w:type="dxa" w:w="45"/>
               <w:right w:type="dxa" w:w="0"/>
             </w:tcMar>
           </w:tcPr>
@@ -802,9 +886,9 @@
               <w:right w:val="none" w:color="FFFFFF" w:sz="0"/>
             </w:tcBorders>
             <w:tcMar>
-              <w:top w:type="dxa" w:w="70"/>
+              <w:top w:type="dxa" w:w="45"/>
               <w:left w:type="dxa" w:w="0"/>
-              <w:bottom w:type="dxa" w:w="70"/>
+              <w:bottom w:type="dxa" w:w="45"/>
               <w:right w:type="dxa" w:w="100"/>
             </w:tcMar>
           </w:tcPr>
@@ -833,9 +917,9 @@
               <w:right w:val="none" w:color="FFFFFF" w:sz="0"/>
             </w:tcBorders>
             <w:tcMar>
-              <w:top w:type="dxa" w:w="70"/>
-              <w:left w:type="dxa" w:w="100"/>
-              <w:bottom w:type="dxa" w:w="70"/>
+              <w:top w:type="dxa" w:w="45"/>
+              <w:left w:type="dxa" w:w="100"/>
+              <w:bottom w:type="dxa" w:w="45"/>
               <w:right w:type="dxa" w:w="100"/>
             </w:tcMar>
           </w:tcPr>
@@ -866,9 +950,9 @@
               <w:right w:val="none" w:color="FFFFFF" w:sz="0"/>
             </w:tcBorders>
             <w:tcMar>
-              <w:top w:type="dxa" w:w="70"/>
-              <w:left w:type="dxa" w:w="100"/>
-              <w:bottom w:type="dxa" w:w="70"/>
+              <w:top w:type="dxa" w:w="45"/>
+              <w:left w:type="dxa" w:w="100"/>
+              <w:bottom w:type="dxa" w:w="45"/>
               <w:right w:type="dxa" w:w="100"/>
             </w:tcMar>
           </w:tcPr>
@@ -897,9 +981,9 @@
               <w:right w:val="none" w:color="FFFFFF" w:sz="0"/>
             </w:tcBorders>
             <w:tcMar>
-              <w:top w:type="dxa" w:w="70"/>
-              <w:left w:type="dxa" w:w="100"/>
-              <w:bottom w:type="dxa" w:w="70"/>
+              <w:top w:type="dxa" w:w="45"/>
+              <w:left w:type="dxa" w:w="100"/>
+              <w:bottom w:type="dxa" w:w="45"/>
               <w:right w:type="dxa" w:w="0"/>
             </w:tcMar>
           </w:tcPr>
@@ -933,9 +1017,9 @@
               <w:right w:val="none" w:color="FFFFFF" w:sz="0"/>
             </w:tcBorders>
             <w:tcMar>
-              <w:top w:type="dxa" w:w="70"/>
+              <w:top w:type="dxa" w:w="45"/>
               <w:left w:type="dxa" w:w="0"/>
-              <w:bottom w:type="dxa" w:w="70"/>
+              <w:bottom w:type="dxa" w:w="45"/>
               <w:right w:type="dxa" w:w="100"/>
             </w:tcMar>
           </w:tcPr>
@@ -964,9 +1048,9 @@
               <w:right w:val="none" w:color="FFFFFF" w:sz="0"/>
             </w:tcBorders>
             <w:tcMar>
-              <w:top w:type="dxa" w:w="70"/>
-              <w:left w:type="dxa" w:w="100"/>
-              <w:bottom w:type="dxa" w:w="70"/>
+              <w:top w:type="dxa" w:w="45"/>
+              <w:left w:type="dxa" w:w="100"/>
+              <w:bottom w:type="dxa" w:w="45"/>
               <w:right w:type="dxa" w:w="100"/>
             </w:tcMar>
           </w:tcPr>
@@ -997,9 +1081,9 @@
               <w:right w:val="none" w:color="FFFFFF" w:sz="0"/>
             </w:tcBorders>
             <w:tcMar>
-              <w:top w:type="dxa" w:w="70"/>
-              <w:left w:type="dxa" w:w="100"/>
-              <w:bottom w:type="dxa" w:w="70"/>
+              <w:top w:type="dxa" w:w="45"/>
+              <w:left w:type="dxa" w:w="100"/>
+              <w:bottom w:type="dxa" w:w="45"/>
               <w:right w:type="dxa" w:w="100"/>
             </w:tcMar>
           </w:tcPr>
@@ -1028,9 +1112,9 @@
               <w:right w:val="none" w:color="FFFFFF" w:sz="0"/>
             </w:tcBorders>
             <w:tcMar>
-              <w:top w:type="dxa" w:w="70"/>
-              <w:left w:type="dxa" w:w="100"/>
-              <w:bottom w:type="dxa" w:w="70"/>
+              <w:top w:type="dxa" w:w="45"/>
+              <w:left w:type="dxa" w:w="100"/>
+              <w:bottom w:type="dxa" w:w="45"/>
               <w:right w:type="dxa" w:w="0"/>
             </w:tcMar>
           </w:tcPr>
@@ -1064,9 +1148,9 @@
               <w:right w:val="none" w:color="FFFFFF" w:sz="0"/>
             </w:tcBorders>
             <w:tcMar>
-              <w:top w:type="dxa" w:w="70"/>
+              <w:top w:type="dxa" w:w="45"/>
               <w:left w:type="dxa" w:w="0"/>
-              <w:bottom w:type="dxa" w:w="70"/>
+              <w:bottom w:type="dxa" w:w="45"/>
               <w:right w:type="dxa" w:w="100"/>
             </w:tcMar>
           </w:tcPr>
@@ -1095,9 +1179,9 @@
               <w:right w:val="none" w:color="FFFFFF" w:sz="0"/>
             </w:tcBorders>
             <w:tcMar>
-              <w:top w:type="dxa" w:w="70"/>
-              <w:left w:type="dxa" w:w="100"/>
-              <w:bottom w:type="dxa" w:w="70"/>
+              <w:top w:type="dxa" w:w="45"/>
+              <w:left w:type="dxa" w:w="100"/>
+              <w:bottom w:type="dxa" w:w="45"/>
               <w:right w:type="dxa" w:w="100"/>
             </w:tcMar>
           </w:tcPr>
@@ -1128,9 +1212,9 @@
               <w:right w:val="none" w:color="FFFFFF" w:sz="0"/>
             </w:tcBorders>
             <w:tcMar>
-              <w:top w:type="dxa" w:w="70"/>
-              <w:left w:type="dxa" w:w="100"/>
-              <w:bottom w:type="dxa" w:w="70"/>
+              <w:top w:type="dxa" w:w="45"/>
+              <w:left w:type="dxa" w:w="100"/>
+              <w:bottom w:type="dxa" w:w="45"/>
               <w:right w:type="dxa" w:w="100"/>
             </w:tcMar>
           </w:tcPr>
@@ -1159,9 +1243,9 @@
               <w:right w:val="none" w:color="FFFFFF" w:sz="0"/>
             </w:tcBorders>
             <w:tcMar>
-              <w:top w:type="dxa" w:w="70"/>
-              <w:left w:type="dxa" w:w="100"/>
-              <w:bottom w:type="dxa" w:w="70"/>
+              <w:top w:type="dxa" w:w="45"/>
+              <w:left w:type="dxa" w:w="100"/>
+              <w:bottom w:type="dxa" w:w="45"/>
               <w:right w:type="dxa" w:w="0"/>
             </w:tcMar>
           </w:tcPr>
@@ -1195,9 +1279,9 @@
               <w:right w:val="none" w:color="FFFFFF" w:sz="0"/>
             </w:tcBorders>
             <w:tcMar>
-              <w:top w:type="dxa" w:w="70"/>
+              <w:top w:type="dxa" w:w="45"/>
               <w:left w:type="dxa" w:w="0"/>
-              <w:bottom w:type="dxa" w:w="70"/>
+              <w:bottom w:type="dxa" w:w="45"/>
               <w:right w:type="dxa" w:w="100"/>
             </w:tcMar>
           </w:tcPr>
@@ -1226,9 +1310,9 @@
               <w:right w:val="none" w:color="FFFFFF" w:sz="0"/>
             </w:tcBorders>
             <w:tcMar>
-              <w:top w:type="dxa" w:w="70"/>
-              <w:left w:type="dxa" w:w="100"/>
-              <w:bottom w:type="dxa" w:w="70"/>
+              <w:top w:type="dxa" w:w="45"/>
+              <w:left w:type="dxa" w:w="100"/>
+              <w:bottom w:type="dxa" w:w="45"/>
               <w:right w:type="dxa" w:w="100"/>
             </w:tcMar>
           </w:tcPr>
@@ -1259,9 +1343,9 @@
               <w:right w:val="none" w:color="FFFFFF" w:sz="0"/>
             </w:tcBorders>
             <w:tcMar>
-              <w:top w:type="dxa" w:w="70"/>
-              <w:left w:type="dxa" w:w="100"/>
-              <w:bottom w:type="dxa" w:w="70"/>
+              <w:top w:type="dxa" w:w="45"/>
+              <w:left w:type="dxa" w:w="100"/>
+              <w:bottom w:type="dxa" w:w="45"/>
               <w:right w:type="dxa" w:w="100"/>
             </w:tcMar>
           </w:tcPr>
@@ -1290,9 +1374,9 @@
               <w:right w:val="none" w:color="FFFFFF" w:sz="0"/>
             </w:tcBorders>
             <w:tcMar>
-              <w:top w:type="dxa" w:w="70"/>
-              <w:left w:type="dxa" w:w="100"/>
-              <w:bottom w:type="dxa" w:w="70"/>
+              <w:top w:type="dxa" w:w="45"/>
+              <w:left w:type="dxa" w:w="100"/>
+              <w:bottom w:type="dxa" w:w="45"/>
               <w:right w:type="dxa" w:w="0"/>
             </w:tcMar>
           </w:tcPr>
@@ -1326,9 +1410,9 @@
               <w:right w:val="none" w:color="FFFFFF" w:sz="0"/>
             </w:tcBorders>
             <w:tcMar>
-              <w:top w:type="dxa" w:w="70"/>
+              <w:top w:type="dxa" w:w="45"/>
               <w:left w:type="dxa" w:w="0"/>
-              <w:bottom w:type="dxa" w:w="70"/>
+              <w:bottom w:type="dxa" w:w="45"/>
               <w:right w:type="dxa" w:w="100"/>
             </w:tcMar>
           </w:tcPr>
@@ -1357,9 +1441,9 @@
               <w:right w:val="none" w:color="FFFFFF" w:sz="0"/>
             </w:tcBorders>
             <w:tcMar>
-              <w:top w:type="dxa" w:w="70"/>
-              <w:left w:type="dxa" w:w="100"/>
-              <w:bottom w:type="dxa" w:w="70"/>
+              <w:top w:type="dxa" w:w="45"/>
+              <w:left w:type="dxa" w:w="100"/>
+              <w:bottom w:type="dxa" w:w="45"/>
               <w:right w:type="dxa" w:w="100"/>
             </w:tcMar>
           </w:tcPr>
@@ -1390,9 +1474,9 @@
               <w:right w:val="none" w:color="FFFFFF" w:sz="0"/>
             </w:tcBorders>
             <w:tcMar>
-              <w:top w:type="dxa" w:w="70"/>
-              <w:left w:type="dxa" w:w="100"/>
-              <w:bottom w:type="dxa" w:w="70"/>
+              <w:top w:type="dxa" w:w="45"/>
+              <w:left w:type="dxa" w:w="100"/>
+              <w:bottom w:type="dxa" w:w="45"/>
               <w:right w:type="dxa" w:w="100"/>
             </w:tcMar>
           </w:tcPr>
@@ -1421,9 +1505,9 @@
               <w:right w:val="none" w:color="FFFFFF" w:sz="0"/>
             </w:tcBorders>
             <w:tcMar>
-              <w:top w:type="dxa" w:w="70"/>
-              <w:left w:type="dxa" w:w="100"/>
-              <w:bottom w:type="dxa" w:w="70"/>
+              <w:top w:type="dxa" w:w="45"/>
+              <w:left w:type="dxa" w:w="100"/>
+              <w:bottom w:type="dxa" w:w="45"/>
               <w:right w:type="dxa" w:w="0"/>
             </w:tcMar>
           </w:tcPr>
@@ -1457,9 +1541,9 @@
               <w:right w:val="none" w:color="FFFFFF" w:sz="0"/>
             </w:tcBorders>
             <w:tcMar>
-              <w:top w:type="dxa" w:w="70"/>
+              <w:top w:type="dxa" w:w="45"/>
               <w:left w:type="dxa" w:w="0"/>
-              <w:bottom w:type="dxa" w:w="70"/>
+              <w:bottom w:type="dxa" w:w="45"/>
               <w:right w:type="dxa" w:w="100"/>
             </w:tcMar>
           </w:tcPr>
@@ -1488,9 +1572,9 @@
               <w:right w:val="none" w:color="FFFFFF" w:sz="0"/>
             </w:tcBorders>
             <w:tcMar>
-              <w:top w:type="dxa" w:w="70"/>
-              <w:left w:type="dxa" w:w="100"/>
-              <w:bottom w:type="dxa" w:w="70"/>
+              <w:top w:type="dxa" w:w="45"/>
+              <w:left w:type="dxa" w:w="100"/>
+              <w:bottom w:type="dxa" w:w="45"/>
               <w:right w:type="dxa" w:w="100"/>
             </w:tcMar>
           </w:tcPr>
@@ -1521,9 +1605,9 @@
               <w:right w:val="none" w:color="FFFFFF" w:sz="0"/>
             </w:tcBorders>
             <w:tcMar>
-              <w:top w:type="dxa" w:w="70"/>
-              <w:left w:type="dxa" w:w="100"/>
-              <w:bottom w:type="dxa" w:w="70"/>
+              <w:top w:type="dxa" w:w="45"/>
+              <w:left w:type="dxa" w:w="100"/>
+              <w:bottom w:type="dxa" w:w="45"/>
               <w:right w:type="dxa" w:w="100"/>
             </w:tcMar>
           </w:tcPr>
@@ -1552,9 +1636,9 @@
               <w:right w:val="none" w:color="FFFFFF" w:sz="0"/>
             </w:tcBorders>
             <w:tcMar>
-              <w:top w:type="dxa" w:w="70"/>
-              <w:left w:type="dxa" w:w="100"/>
-              <w:bottom w:type="dxa" w:w="70"/>
+              <w:top w:type="dxa" w:w="45"/>
+              <w:left w:type="dxa" w:w="100"/>
+              <w:bottom w:type="dxa" w:w="45"/>
               <w:right w:type="dxa" w:w="0"/>
             </w:tcMar>
           </w:tcPr>
@@ -1588,9 +1672,9 @@
               <w:right w:val="none" w:color="FFFFFF" w:sz="0"/>
             </w:tcBorders>
             <w:tcMar>
-              <w:top w:type="dxa" w:w="70"/>
+              <w:top w:type="dxa" w:w="45"/>
               <w:left w:type="dxa" w:w="0"/>
-              <w:bottom w:type="dxa" w:w="70"/>
+              <w:bottom w:type="dxa" w:w="45"/>
               <w:right w:type="dxa" w:w="100"/>
             </w:tcMar>
           </w:tcPr>
@@ -1619,9 +1703,9 @@
               <w:right w:val="none" w:color="FFFFFF" w:sz="0"/>
             </w:tcBorders>
             <w:tcMar>
-              <w:top w:type="dxa" w:w="70"/>
-              <w:left w:type="dxa" w:w="100"/>
-              <w:bottom w:type="dxa" w:w="70"/>
+              <w:top w:type="dxa" w:w="45"/>
+              <w:left w:type="dxa" w:w="100"/>
+              <w:bottom w:type="dxa" w:w="45"/>
               <w:right w:type="dxa" w:w="100"/>
             </w:tcMar>
           </w:tcPr>
@@ -1652,9 +1736,9 @@
               <w:right w:val="none" w:color="FFFFFF" w:sz="0"/>
             </w:tcBorders>
             <w:tcMar>
-              <w:top w:type="dxa" w:w="70"/>
-              <w:left w:type="dxa" w:w="100"/>
-              <w:bottom w:type="dxa" w:w="70"/>
+              <w:top w:type="dxa" w:w="45"/>
+              <w:left w:type="dxa" w:w="100"/>
+              <w:bottom w:type="dxa" w:w="45"/>
               <w:right w:type="dxa" w:w="100"/>
             </w:tcMar>
           </w:tcPr>
@@ -1683,9 +1767,9 @@
               <w:right w:val="none" w:color="FFFFFF" w:sz="0"/>
             </w:tcBorders>
             <w:tcMar>
-              <w:top w:type="dxa" w:w="70"/>
-              <w:left w:type="dxa" w:w="100"/>
-              <w:bottom w:type="dxa" w:w="70"/>
+              <w:top w:type="dxa" w:w="45"/>
+              <w:left w:type="dxa" w:w="100"/>
+              <w:bottom w:type="dxa" w:w="45"/>
               <w:right w:type="dxa" w:w="0"/>
             </w:tcMar>
           </w:tcPr>
@@ -1719,9 +1803,9 @@
               <w:right w:val="none" w:color="FFFFFF" w:sz="0"/>
             </w:tcBorders>
             <w:tcMar>
-              <w:top w:type="dxa" w:w="70"/>
+              <w:top w:type="dxa" w:w="45"/>
               <w:left w:type="dxa" w:w="0"/>
-              <w:bottom w:type="dxa" w:w="70"/>
+              <w:bottom w:type="dxa" w:w="45"/>
               <w:right w:type="dxa" w:w="100"/>
             </w:tcMar>
           </w:tcPr>
@@ -1750,9 +1834,9 @@
               <w:right w:val="none" w:color="FFFFFF" w:sz="0"/>
             </w:tcBorders>
             <w:tcMar>
-              <w:top w:type="dxa" w:w="70"/>
-              <w:left w:type="dxa" w:w="100"/>
-              <w:bottom w:type="dxa" w:w="70"/>
+              <w:top w:type="dxa" w:w="45"/>
+              <w:left w:type="dxa" w:w="100"/>
+              <w:bottom w:type="dxa" w:w="45"/>
               <w:right w:type="dxa" w:w="100"/>
             </w:tcMar>
           </w:tcPr>
@@ -1783,9 +1867,9 @@
               <w:right w:val="none" w:color="FFFFFF" w:sz="0"/>
             </w:tcBorders>
             <w:tcMar>
-              <w:top w:type="dxa" w:w="70"/>
-              <w:left w:type="dxa" w:w="100"/>
-              <w:bottom w:type="dxa" w:w="70"/>
+              <w:top w:type="dxa" w:w="45"/>
+              <w:left w:type="dxa" w:w="100"/>
+              <w:bottom w:type="dxa" w:w="45"/>
               <w:right w:type="dxa" w:w="100"/>
             </w:tcMar>
           </w:tcPr>
@@ -1814,9 +1898,9 @@
               <w:right w:val="none" w:color="FFFFFF" w:sz="0"/>
             </w:tcBorders>
             <w:tcMar>
-              <w:top w:type="dxa" w:w="70"/>
-              <w:left w:type="dxa" w:w="100"/>
-              <w:bottom w:type="dxa" w:w="70"/>
+              <w:top w:type="dxa" w:w="45"/>
+              <w:left w:type="dxa" w:w="100"/>
+              <w:bottom w:type="dxa" w:w="45"/>
               <w:right w:type="dxa" w:w="0"/>
             </w:tcMar>
           </w:tcPr>
@@ -1850,9 +1934,9 @@
               <w:right w:val="none" w:color="FFFFFF" w:sz="0"/>
             </w:tcBorders>
             <w:tcMar>
-              <w:top w:type="dxa" w:w="70"/>
+              <w:top w:type="dxa" w:w="45"/>
               <w:left w:type="dxa" w:w="0"/>
-              <w:bottom w:type="dxa" w:w="70"/>
+              <w:bottom w:type="dxa" w:w="45"/>
               <w:right w:type="dxa" w:w="100"/>
             </w:tcMar>
           </w:tcPr>
@@ -1881,9 +1965,9 @@
               <w:right w:val="none" w:color="FFFFFF" w:sz="0"/>
             </w:tcBorders>
             <w:tcMar>
-              <w:top w:type="dxa" w:w="70"/>
-              <w:left w:type="dxa" w:w="100"/>
-              <w:bottom w:type="dxa" w:w="70"/>
+              <w:top w:type="dxa" w:w="45"/>
+              <w:left w:type="dxa" w:w="100"/>
+              <w:bottom w:type="dxa" w:w="45"/>
               <w:right w:type="dxa" w:w="100"/>
             </w:tcMar>
           </w:tcPr>
@@ -1914,9 +1998,9 @@
               <w:right w:val="none" w:color="FFFFFF" w:sz="0"/>
             </w:tcBorders>
             <w:tcMar>
-              <w:top w:type="dxa" w:w="70"/>
-              <w:left w:type="dxa" w:w="100"/>
-              <w:bottom w:type="dxa" w:w="70"/>
+              <w:top w:type="dxa" w:w="45"/>
+              <w:left w:type="dxa" w:w="100"/>
+              <w:bottom w:type="dxa" w:w="45"/>
               <w:right w:type="dxa" w:w="100"/>
             </w:tcMar>
           </w:tcPr>
@@ -1945,9 +2029,9 @@
               <w:right w:val="none" w:color="FFFFFF" w:sz="0"/>
             </w:tcBorders>
             <w:tcMar>
-              <w:top w:type="dxa" w:w="70"/>
-              <w:left w:type="dxa" w:w="100"/>
-              <w:bottom w:type="dxa" w:w="70"/>
+              <w:top w:type="dxa" w:w="45"/>
+              <w:left w:type="dxa" w:w="100"/>
+              <w:bottom w:type="dxa" w:w="45"/>
               <w:right w:type="dxa" w:w="0"/>
             </w:tcMar>
           </w:tcPr>
@@ -1981,9 +2065,9 @@
               <w:right w:val="none" w:color="FFFFFF" w:sz="0"/>
             </w:tcBorders>
             <w:tcMar>
-              <w:top w:type="dxa" w:w="70"/>
+              <w:top w:type="dxa" w:w="45"/>
               <w:left w:type="dxa" w:w="0"/>
-              <w:bottom w:type="dxa" w:w="70"/>
+              <w:bottom w:type="dxa" w:w="45"/>
               <w:right w:type="dxa" w:w="100"/>
             </w:tcMar>
           </w:tcPr>
@@ -2012,9 +2096,9 @@
               <w:right w:val="none" w:color="FFFFFF" w:sz="0"/>
             </w:tcBorders>
             <w:tcMar>
-              <w:top w:type="dxa" w:w="70"/>
-              <w:left w:type="dxa" w:w="100"/>
-              <w:bottom w:type="dxa" w:w="70"/>
+              <w:top w:type="dxa" w:w="45"/>
+              <w:left w:type="dxa" w:w="100"/>
+              <w:bottom w:type="dxa" w:w="45"/>
               <w:right w:type="dxa" w:w="100"/>
             </w:tcMar>
           </w:tcPr>
@@ -2045,9 +2129,9 @@
               <w:right w:val="none" w:color="FFFFFF" w:sz="0"/>
             </w:tcBorders>
             <w:tcMar>
-              <w:top w:type="dxa" w:w="70"/>
-              <w:left w:type="dxa" w:w="100"/>
-              <w:bottom w:type="dxa" w:w="70"/>
+              <w:top w:type="dxa" w:w="45"/>
+              <w:left w:type="dxa" w:w="100"/>
+              <w:bottom w:type="dxa" w:w="45"/>
               <w:right w:type="dxa" w:w="100"/>
             </w:tcMar>
           </w:tcPr>
@@ -2076,9 +2160,9 @@
               <w:right w:val="none" w:color="FFFFFF" w:sz="0"/>
             </w:tcBorders>
             <w:tcMar>
-              <w:top w:type="dxa" w:w="70"/>
-              <w:left w:type="dxa" w:w="100"/>
-              <w:bottom w:type="dxa" w:w="70"/>
+              <w:top w:type="dxa" w:w="45"/>
+              <w:left w:type="dxa" w:w="100"/>
+              <w:bottom w:type="dxa" w:w="45"/>
               <w:right w:type="dxa" w:w="0"/>
             </w:tcMar>
           </w:tcPr>
@@ -2112,9 +2196,9 @@
               <w:right w:val="none" w:color="FFFFFF" w:sz="0"/>
             </w:tcBorders>
             <w:tcMar>
-              <w:top w:type="dxa" w:w="70"/>
+              <w:top w:type="dxa" w:w="45"/>
               <w:left w:type="dxa" w:w="0"/>
-              <w:bottom w:type="dxa" w:w="70"/>
+              <w:bottom w:type="dxa" w:w="45"/>
               <w:right w:type="dxa" w:w="100"/>
             </w:tcMar>
           </w:tcPr>
@@ -2143,9 +2227,9 @@
               <w:right w:val="none" w:color="FFFFFF" w:sz="0"/>
             </w:tcBorders>
             <w:tcMar>
-              <w:top w:type="dxa" w:w="70"/>
-              <w:left w:type="dxa" w:w="100"/>
-              <w:bottom w:type="dxa" w:w="70"/>
+              <w:top w:type="dxa" w:w="45"/>
+              <w:left w:type="dxa" w:w="100"/>
+              <w:bottom w:type="dxa" w:w="45"/>
               <w:right w:type="dxa" w:w="100"/>
             </w:tcMar>
           </w:tcPr>
@@ -2176,9 +2260,9 @@
               <w:right w:val="none" w:color="FFFFFF" w:sz="0"/>
             </w:tcBorders>
             <w:tcMar>
-              <w:top w:type="dxa" w:w="70"/>
-              <w:left w:type="dxa" w:w="100"/>
-              <w:bottom w:type="dxa" w:w="70"/>
+              <w:top w:type="dxa" w:w="45"/>
+              <w:left w:type="dxa" w:w="100"/>
+              <w:bottom w:type="dxa" w:w="45"/>
               <w:right w:type="dxa" w:w="100"/>
             </w:tcMar>
           </w:tcPr>
@@ -2207,9 +2291,9 @@
               <w:right w:val="none" w:color="FFFFFF" w:sz="0"/>
             </w:tcBorders>
             <w:tcMar>
-              <w:top w:type="dxa" w:w="70"/>
-              <w:left w:type="dxa" w:w="100"/>
-              <w:bottom w:type="dxa" w:w="70"/>
+              <w:top w:type="dxa" w:w="45"/>
+              <w:left w:type="dxa" w:w="100"/>
+              <w:bottom w:type="dxa" w:w="45"/>
               <w:right w:type="dxa" w:w="0"/>
             </w:tcMar>
           </w:tcPr>
@@ -2243,9 +2327,9 @@
               <w:right w:val="none" w:color="FFFFFF" w:sz="0"/>
             </w:tcBorders>
             <w:tcMar>
-              <w:top w:type="dxa" w:w="70"/>
+              <w:top w:type="dxa" w:w="45"/>
               <w:left w:type="dxa" w:w="0"/>
-              <w:bottom w:type="dxa" w:w="70"/>
+              <w:bottom w:type="dxa" w:w="45"/>
               <w:right w:type="dxa" w:w="100"/>
             </w:tcMar>
           </w:tcPr>
@@ -2274,9 +2358,9 @@
               <w:right w:val="none" w:color="FFFFFF" w:sz="0"/>
             </w:tcBorders>
             <w:tcMar>
-              <w:top w:type="dxa" w:w="70"/>
-              <w:left w:type="dxa" w:w="100"/>
-              <w:bottom w:type="dxa" w:w="70"/>
+              <w:top w:type="dxa" w:w="45"/>
+              <w:left w:type="dxa" w:w="100"/>
+              <w:bottom w:type="dxa" w:w="45"/>
               <w:right w:type="dxa" w:w="100"/>
             </w:tcMar>
           </w:tcPr>
@@ -2307,9 +2391,9 @@
               <w:right w:val="none" w:color="FFFFFF" w:sz="0"/>
             </w:tcBorders>
             <w:tcMar>
-              <w:top w:type="dxa" w:w="70"/>
-              <w:left w:type="dxa" w:w="100"/>
-              <w:bottom w:type="dxa" w:w="70"/>
+              <w:top w:type="dxa" w:w="45"/>
+              <w:left w:type="dxa" w:w="100"/>
+              <w:bottom w:type="dxa" w:w="45"/>
               <w:right w:type="dxa" w:w="100"/>
             </w:tcMar>
           </w:tcPr>
@@ -2338,9 +2422,9 @@
               <w:right w:val="none" w:color="FFFFFF" w:sz="0"/>
             </w:tcBorders>
             <w:tcMar>
-              <w:top w:type="dxa" w:w="70"/>
-              <w:left w:type="dxa" w:w="100"/>
-              <w:bottom w:type="dxa" w:w="70"/>
+              <w:top w:type="dxa" w:w="45"/>
+              <w:left w:type="dxa" w:w="100"/>
+              <w:bottom w:type="dxa" w:w="45"/>
               <w:right w:type="dxa" w:w="0"/>
             </w:tcMar>
           </w:tcPr>
@@ -2374,9 +2458,9 @@
               <w:right w:val="none" w:color="FFFFFF" w:sz="0"/>
             </w:tcBorders>
             <w:tcMar>
-              <w:top w:type="dxa" w:w="70"/>
+              <w:top w:type="dxa" w:w="45"/>
               <w:left w:type="dxa" w:w="0"/>
-              <w:bottom w:type="dxa" w:w="70"/>
+              <w:bottom w:type="dxa" w:w="45"/>
               <w:right w:type="dxa" w:w="100"/>
             </w:tcMar>
           </w:tcPr>
@@ -2405,9 +2489,9 @@
               <w:right w:val="none" w:color="FFFFFF" w:sz="0"/>
             </w:tcBorders>
             <w:tcMar>
-              <w:top w:type="dxa" w:w="70"/>
-              <w:left w:type="dxa" w:w="100"/>
-              <w:bottom w:type="dxa" w:w="70"/>
+              <w:top w:type="dxa" w:w="45"/>
+              <w:left w:type="dxa" w:w="100"/>
+              <w:bottom w:type="dxa" w:w="45"/>
               <w:right w:type="dxa" w:w="100"/>
             </w:tcMar>
           </w:tcPr>
@@ -2438,9 +2522,9 @@
               <w:right w:val="none" w:color="FFFFFF" w:sz="0"/>
             </w:tcBorders>
             <w:tcMar>
-              <w:top w:type="dxa" w:w="70"/>
-              <w:left w:type="dxa" w:w="100"/>
-              <w:bottom w:type="dxa" w:w="70"/>
+              <w:top w:type="dxa" w:w="45"/>
+              <w:left w:type="dxa" w:w="100"/>
+              <w:bottom w:type="dxa" w:w="45"/>
               <w:right w:type="dxa" w:w="100"/>
             </w:tcMar>
           </w:tcPr>
@@ -2469,9 +2553,9 @@
               <w:right w:val="none" w:color="FFFFFF" w:sz="0"/>
             </w:tcBorders>
             <w:tcMar>
-              <w:top w:type="dxa" w:w="70"/>
-              <w:left w:type="dxa" w:w="100"/>
-              <w:bottom w:type="dxa" w:w="70"/>
+              <w:top w:type="dxa" w:w="45"/>
+              <w:left w:type="dxa" w:w="100"/>
+              <w:bottom w:type="dxa" w:w="45"/>
               <w:right w:type="dxa" w:w="0"/>
             </w:tcMar>
           </w:tcPr>
@@ -2505,9 +2589,9 @@
               <w:right w:val="none" w:color="FFFFFF" w:sz="0"/>
             </w:tcBorders>
             <w:tcMar>
-              <w:top w:type="dxa" w:w="70"/>
+              <w:top w:type="dxa" w:w="45"/>
               <w:left w:type="dxa" w:w="0"/>
-              <w:bottom w:type="dxa" w:w="70"/>
+              <w:bottom w:type="dxa" w:w="45"/>
               <w:right w:type="dxa" w:w="100"/>
             </w:tcMar>
           </w:tcPr>
@@ -2536,9 +2620,9 @@
               <w:right w:val="none" w:color="FFFFFF" w:sz="0"/>
             </w:tcBorders>
             <w:tcMar>
-              <w:top w:type="dxa" w:w="70"/>
-              <w:left w:type="dxa" w:w="100"/>
-              <w:bottom w:type="dxa" w:w="70"/>
+              <w:top w:type="dxa" w:w="45"/>
+              <w:left w:type="dxa" w:w="100"/>
+              <w:bottom w:type="dxa" w:w="45"/>
               <w:right w:type="dxa" w:w="100"/>
             </w:tcMar>
           </w:tcPr>
@@ -2569,9 +2653,9 @@
               <w:right w:val="none" w:color="FFFFFF" w:sz="0"/>
             </w:tcBorders>
             <w:tcMar>
-              <w:top w:type="dxa" w:w="70"/>
-              <w:left w:type="dxa" w:w="100"/>
-              <w:bottom w:type="dxa" w:w="70"/>
+              <w:top w:type="dxa" w:w="45"/>
+              <w:left w:type="dxa" w:w="100"/>
+              <w:bottom w:type="dxa" w:w="45"/>
               <w:right w:type="dxa" w:w="100"/>
             </w:tcMar>
           </w:tcPr>
@@ -2600,9 +2684,9 @@
               <w:right w:val="none" w:color="FFFFFF" w:sz="0"/>
             </w:tcBorders>
             <w:tcMar>
-              <w:top w:type="dxa" w:w="70"/>
-              <w:left w:type="dxa" w:w="100"/>
-              <w:bottom w:type="dxa" w:w="70"/>
+              <w:top w:type="dxa" w:w="45"/>
+              <w:left w:type="dxa" w:w="100"/>
+              <w:bottom w:type="dxa" w:w="45"/>
               <w:right w:type="dxa" w:w="0"/>
             </w:tcMar>
           </w:tcPr>
@@ -2636,9 +2720,9 @@
               <w:right w:val="none" w:color="FFFFFF" w:sz="0"/>
             </w:tcBorders>
             <w:tcMar>
-              <w:top w:type="dxa" w:w="70"/>
+              <w:top w:type="dxa" w:w="45"/>
               <w:left w:type="dxa" w:w="0"/>
-              <w:bottom w:type="dxa" w:w="70"/>
+              <w:bottom w:type="dxa" w:w="45"/>
               <w:right w:type="dxa" w:w="100"/>
             </w:tcMar>
           </w:tcPr>
@@ -2667,9 +2751,9 @@
               <w:right w:val="none" w:color="FFFFFF" w:sz="0"/>
             </w:tcBorders>
             <w:tcMar>
-              <w:top w:type="dxa" w:w="70"/>
-              <w:left w:type="dxa" w:w="100"/>
-              <w:bottom w:type="dxa" w:w="70"/>
+              <w:top w:type="dxa" w:w="45"/>
+              <w:left w:type="dxa" w:w="100"/>
+              <w:bottom w:type="dxa" w:w="45"/>
               <w:right w:type="dxa" w:w="100"/>
             </w:tcMar>
           </w:tcPr>
@@ -2700,9 +2784,9 @@
               <w:right w:val="none" w:color="FFFFFF" w:sz="0"/>
             </w:tcBorders>
             <w:tcMar>
-              <w:top w:type="dxa" w:w="70"/>
-              <w:left w:type="dxa" w:w="100"/>
-              <w:bottom w:type="dxa" w:w="70"/>
+              <w:top w:type="dxa" w:w="45"/>
+              <w:left w:type="dxa" w:w="100"/>
+              <w:bottom w:type="dxa" w:w="45"/>
               <w:right w:type="dxa" w:w="100"/>
             </w:tcMar>
           </w:tcPr>
@@ -2731,9 +2815,9 @@
               <w:right w:val="none" w:color="FFFFFF" w:sz="0"/>
             </w:tcBorders>
             <w:tcMar>
-              <w:top w:type="dxa" w:w="70"/>
-              <w:left w:type="dxa" w:w="100"/>
-              <w:bottom w:type="dxa" w:w="70"/>
+              <w:top w:type="dxa" w:w="45"/>
+              <w:left w:type="dxa" w:w="100"/>
+              <w:bottom w:type="dxa" w:w="45"/>
               <w:right w:type="dxa" w:w="0"/>
             </w:tcMar>
           </w:tcPr>
@@ -2767,9 +2851,9 @@
               <w:right w:val="none" w:color="FFFFFF" w:sz="0"/>
             </w:tcBorders>
             <w:tcMar>
-              <w:top w:type="dxa" w:w="70"/>
+              <w:top w:type="dxa" w:w="45"/>
               <w:left w:type="dxa" w:w="0"/>
-              <w:bottom w:type="dxa" w:w="70"/>
+              <w:bottom w:type="dxa" w:w="45"/>
               <w:right w:type="dxa" w:w="100"/>
             </w:tcMar>
           </w:tcPr>
@@ -2798,9 +2882,9 @@
               <w:right w:val="none" w:color="FFFFFF" w:sz="0"/>
             </w:tcBorders>
             <w:tcMar>
-              <w:top w:type="dxa" w:w="70"/>
-              <w:left w:type="dxa" w:w="100"/>
-              <w:bottom w:type="dxa" w:w="70"/>
+              <w:top w:type="dxa" w:w="45"/>
+              <w:left w:type="dxa" w:w="100"/>
+              <w:bottom w:type="dxa" w:w="45"/>
               <w:right w:type="dxa" w:w="100"/>
             </w:tcMar>
           </w:tcPr>
@@ -2831,9 +2915,9 @@
               <w:right w:val="none" w:color="FFFFFF" w:sz="0"/>
             </w:tcBorders>
             <w:tcMar>
-              <w:top w:type="dxa" w:w="70"/>
-              <w:left w:type="dxa" w:w="100"/>
-              <w:bottom w:type="dxa" w:w="70"/>
+              <w:top w:type="dxa" w:w="45"/>
+              <w:left w:type="dxa" w:w="100"/>
+              <w:bottom w:type="dxa" w:w="45"/>
               <w:right w:type="dxa" w:w="100"/>
             </w:tcMar>
           </w:tcPr>
@@ -2862,9 +2946,9 @@
               <w:right w:val="none" w:color="FFFFFF" w:sz="0"/>
             </w:tcBorders>
             <w:tcMar>
-              <w:top w:type="dxa" w:w="70"/>
-              <w:left w:type="dxa" w:w="100"/>
-              <w:bottom w:type="dxa" w:w="70"/>
+              <w:top w:type="dxa" w:w="45"/>
+              <w:left w:type="dxa" w:w="100"/>
+              <w:bottom w:type="dxa" w:w="45"/>
               <w:right w:type="dxa" w:w="0"/>
             </w:tcMar>
           </w:tcPr>
@@ -2898,9 +2982,9 @@
               <w:right w:val="none" w:color="FFFFFF" w:sz="0"/>
             </w:tcBorders>
             <w:tcMar>
-              <w:top w:type="dxa" w:w="70"/>
+              <w:top w:type="dxa" w:w="45"/>
               <w:left w:type="dxa" w:w="0"/>
-              <w:bottom w:type="dxa" w:w="70"/>
+              <w:bottom w:type="dxa" w:w="45"/>
               <w:right w:type="dxa" w:w="100"/>
             </w:tcMar>
           </w:tcPr>
@@ -2929,9 +3013,9 @@
               <w:right w:val="none" w:color="FFFFFF" w:sz="0"/>
             </w:tcBorders>
             <w:tcMar>
-              <w:top w:type="dxa" w:w="70"/>
-              <w:left w:type="dxa" w:w="100"/>
-              <w:bottom w:type="dxa" w:w="70"/>
+              <w:top w:type="dxa" w:w="45"/>
+              <w:left w:type="dxa" w:w="100"/>
+              <w:bottom w:type="dxa" w:w="45"/>
               <w:right w:type="dxa" w:w="100"/>
             </w:tcMar>
           </w:tcPr>
@@ -2962,9 +3046,9 @@
               <w:right w:val="none" w:color="FFFFFF" w:sz="0"/>
             </w:tcBorders>
             <w:tcMar>
-              <w:top w:type="dxa" w:w="70"/>
-              <w:left w:type="dxa" w:w="100"/>
-              <w:bottom w:type="dxa" w:w="70"/>
+              <w:top w:type="dxa" w:w="45"/>
+              <w:left w:type="dxa" w:w="100"/>
+              <w:bottom w:type="dxa" w:w="45"/>
               <w:right w:type="dxa" w:w="100"/>
             </w:tcMar>
           </w:tcPr>
@@ -2993,9 +3077,9 @@
               <w:right w:val="none" w:color="FFFFFF" w:sz="0"/>
             </w:tcBorders>
             <w:tcMar>
-              <w:top w:type="dxa" w:w="70"/>
-              <w:left w:type="dxa" w:w="100"/>
-              <w:bottom w:type="dxa" w:w="70"/>
+              <w:top w:type="dxa" w:w="45"/>
+              <w:left w:type="dxa" w:w="100"/>
+              <w:bottom w:type="dxa" w:w="45"/>
               <w:right w:type="dxa" w:w="0"/>
             </w:tcMar>
           </w:tcPr>
@@ -3029,9 +3113,9 @@
               <w:right w:val="none" w:color="FFFFFF" w:sz="0"/>
             </w:tcBorders>
             <w:tcMar>
-              <w:top w:type="dxa" w:w="70"/>
+              <w:top w:type="dxa" w:w="45"/>
               <w:left w:type="dxa" w:w="0"/>
-              <w:bottom w:type="dxa" w:w="70"/>
+              <w:bottom w:type="dxa" w:w="45"/>
               <w:right w:type="dxa" w:w="100"/>
             </w:tcMar>
           </w:tcPr>
@@ -3060,9 +3144,9 @@
               <w:right w:val="none" w:color="FFFFFF" w:sz="0"/>
             </w:tcBorders>
             <w:tcMar>
-              <w:top w:type="dxa" w:w="70"/>
-              <w:left w:type="dxa" w:w="100"/>
-              <w:bottom w:type="dxa" w:w="70"/>
+              <w:top w:type="dxa" w:w="45"/>
+              <w:left w:type="dxa" w:w="100"/>
+              <w:bottom w:type="dxa" w:w="45"/>
               <w:right w:type="dxa" w:w="100"/>
             </w:tcMar>
           </w:tcPr>
@@ -3093,9 +3177,9 @@
               <w:right w:val="none" w:color="FFFFFF" w:sz="0"/>
             </w:tcBorders>
             <w:tcMar>
-              <w:top w:type="dxa" w:w="70"/>
-              <w:left w:type="dxa" w:w="100"/>
-              <w:bottom w:type="dxa" w:w="70"/>
+              <w:top w:type="dxa" w:w="45"/>
+              <w:left w:type="dxa" w:w="100"/>
+              <w:bottom w:type="dxa" w:w="45"/>
               <w:right w:type="dxa" w:w="100"/>
             </w:tcMar>
           </w:tcPr>
@@ -3124,9 +3208,9 @@
               <w:right w:val="none" w:color="FFFFFF" w:sz="0"/>
             </w:tcBorders>
             <w:tcMar>
-              <w:top w:type="dxa" w:w="70"/>
-              <w:left w:type="dxa" w:w="100"/>
-              <w:bottom w:type="dxa" w:w="70"/>
+              <w:top w:type="dxa" w:w="45"/>
+              <w:left w:type="dxa" w:w="100"/>
+              <w:bottom w:type="dxa" w:w="45"/>
               <w:right w:type="dxa" w:w="0"/>
             </w:tcMar>
           </w:tcPr>
@@ -3160,9 +3244,9 @@
               <w:right w:val="none" w:color="FFFFFF" w:sz="0"/>
             </w:tcBorders>
             <w:tcMar>
-              <w:top w:type="dxa" w:w="70"/>
+              <w:top w:type="dxa" w:w="45"/>
               <w:left w:type="dxa" w:w="0"/>
-              <w:bottom w:type="dxa" w:w="70"/>
+              <w:bottom w:type="dxa" w:w="45"/>
               <w:right w:type="dxa" w:w="100"/>
             </w:tcMar>
           </w:tcPr>
@@ -3191,9 +3275,9 @@
               <w:right w:val="none" w:color="FFFFFF" w:sz="0"/>
             </w:tcBorders>
             <w:tcMar>
-              <w:top w:type="dxa" w:w="70"/>
-              <w:left w:type="dxa" w:w="100"/>
-              <w:bottom w:type="dxa" w:w="70"/>
+              <w:top w:type="dxa" w:w="45"/>
+              <w:left w:type="dxa" w:w="100"/>
+              <w:bottom w:type="dxa" w:w="45"/>
               <w:right w:type="dxa" w:w="100"/>
             </w:tcMar>
           </w:tcPr>
@@ -3224,9 +3308,9 @@
               <w:right w:val="none" w:color="FFFFFF" w:sz="0"/>
             </w:tcBorders>
             <w:tcMar>
-              <w:top w:type="dxa" w:w="70"/>
-              <w:left w:type="dxa" w:w="100"/>
-              <w:bottom w:type="dxa" w:w="70"/>
+              <w:top w:type="dxa" w:w="45"/>
+              <w:left w:type="dxa" w:w="100"/>
+              <w:bottom w:type="dxa" w:w="45"/>
               <w:right w:type="dxa" w:w="100"/>
             </w:tcMar>
           </w:tcPr>
@@ -3255,9 +3339,9 @@
               <w:right w:val="none" w:color="FFFFFF" w:sz="0"/>
             </w:tcBorders>
             <w:tcMar>
-              <w:top w:type="dxa" w:w="70"/>
-              <w:left w:type="dxa" w:w="100"/>
-              <w:bottom w:type="dxa" w:w="70"/>
+              <w:top w:type="dxa" w:w="45"/>
+              <w:left w:type="dxa" w:w="100"/>
+              <w:bottom w:type="dxa" w:w="45"/>
               <w:right w:type="dxa" w:w="0"/>
             </w:tcMar>
           </w:tcPr>
@@ -3291,9 +3375,9 @@
               <w:right w:val="none" w:color="FFFFFF" w:sz="0"/>
             </w:tcBorders>
             <w:tcMar>
-              <w:top w:type="dxa" w:w="70"/>
+              <w:top w:type="dxa" w:w="45"/>
               <w:left w:type="dxa" w:w="0"/>
-              <w:bottom w:type="dxa" w:w="70"/>
+              <w:bottom w:type="dxa" w:w="45"/>
               <w:right w:type="dxa" w:w="100"/>
             </w:tcMar>
           </w:tcPr>
@@ -3322,9 +3406,9 @@
               <w:right w:val="none" w:color="FFFFFF" w:sz="0"/>
             </w:tcBorders>
             <w:tcMar>
-              <w:top w:type="dxa" w:w="70"/>
-              <w:left w:type="dxa" w:w="100"/>
-              <w:bottom w:type="dxa" w:w="70"/>
+              <w:top w:type="dxa" w:w="45"/>
+              <w:left w:type="dxa" w:w="100"/>
+              <w:bottom w:type="dxa" w:w="45"/>
               <w:right w:type="dxa" w:w="100"/>
             </w:tcMar>
           </w:tcPr>
@@ -3355,9 +3439,9 @@
               <w:right w:val="none" w:color="FFFFFF" w:sz="0"/>
             </w:tcBorders>
             <w:tcMar>
-              <w:top w:type="dxa" w:w="70"/>
-              <w:left w:type="dxa" w:w="100"/>
-              <w:bottom w:type="dxa" w:w="70"/>
+              <w:top w:type="dxa" w:w="45"/>
+              <w:left w:type="dxa" w:w="100"/>
+              <w:bottom w:type="dxa" w:w="45"/>
               <w:right w:type="dxa" w:w="100"/>
             </w:tcMar>
           </w:tcPr>
@@ -3386,9 +3470,9 @@
               <w:right w:val="none" w:color="FFFFFF" w:sz="0"/>
             </w:tcBorders>
             <w:tcMar>
-              <w:top w:type="dxa" w:w="70"/>
-              <w:left w:type="dxa" w:w="100"/>
-              <w:bottom w:type="dxa" w:w="70"/>
+              <w:top w:type="dxa" w:w="45"/>
+              <w:left w:type="dxa" w:w="100"/>
+              <w:bottom w:type="dxa" w:w="45"/>
               <w:right w:type="dxa" w:w="0"/>
             </w:tcMar>
           </w:tcPr>
@@ -3422,9 +3506,9 @@
               <w:right w:val="none" w:color="FFFFFF" w:sz="0"/>
             </w:tcBorders>
             <w:tcMar>
-              <w:top w:type="dxa" w:w="70"/>
+              <w:top w:type="dxa" w:w="45"/>
               <w:left w:type="dxa" w:w="0"/>
-              <w:bottom w:type="dxa" w:w="70"/>
+              <w:bottom w:type="dxa" w:w="45"/>
               <w:right w:type="dxa" w:w="100"/>
             </w:tcMar>
           </w:tcPr>
@@ -3453,9 +3537,9 @@
               <w:right w:val="none" w:color="FFFFFF" w:sz="0"/>
             </w:tcBorders>
             <w:tcMar>
-              <w:top w:type="dxa" w:w="70"/>
-              <w:left w:type="dxa" w:w="100"/>
-              <w:bottom w:type="dxa" w:w="70"/>
+              <w:top w:type="dxa" w:w="45"/>
+              <w:left w:type="dxa" w:w="100"/>
+              <w:bottom w:type="dxa" w:w="45"/>
               <w:right w:type="dxa" w:w="100"/>
             </w:tcMar>
           </w:tcPr>
@@ -3486,9 +3570,9 @@
               <w:right w:val="none" w:color="FFFFFF" w:sz="0"/>
             </w:tcBorders>
             <w:tcMar>
-              <w:top w:type="dxa" w:w="70"/>
-              <w:left w:type="dxa" w:w="100"/>
-              <w:bottom w:type="dxa" w:w="70"/>
+              <w:top w:type="dxa" w:w="45"/>
+              <w:left w:type="dxa" w:w="100"/>
+              <w:bottom w:type="dxa" w:w="45"/>
               <w:right w:type="dxa" w:w="100"/>
             </w:tcMar>
           </w:tcPr>
@@ -3517,9 +3601,9 @@
               <w:right w:val="none" w:color="FFFFFF" w:sz="0"/>
             </w:tcBorders>
             <w:tcMar>
-              <w:top w:type="dxa" w:w="70"/>
-              <w:left w:type="dxa" w:w="100"/>
-              <w:bottom w:type="dxa" w:w="70"/>
+              <w:top w:type="dxa" w:w="45"/>
+              <w:left w:type="dxa" w:w="100"/>
+              <w:bottom w:type="dxa" w:w="45"/>
               <w:right w:type="dxa" w:w="0"/>
             </w:tcMar>
           </w:tcPr>
@@ -3553,9 +3637,9 @@
               <w:right w:val="none" w:color="FFFFFF" w:sz="0"/>
             </w:tcBorders>
             <w:tcMar>
-              <w:top w:type="dxa" w:w="70"/>
+              <w:top w:type="dxa" w:w="45"/>
               <w:left w:type="dxa" w:w="0"/>
-              <w:bottom w:type="dxa" w:w="70"/>
+              <w:bottom w:type="dxa" w:w="45"/>
               <w:right w:type="dxa" w:w="100"/>
             </w:tcMar>
           </w:tcPr>
@@ -3584,9 +3668,9 @@
               <w:right w:val="none" w:color="FFFFFF" w:sz="0"/>
             </w:tcBorders>
             <w:tcMar>
-              <w:top w:type="dxa" w:w="70"/>
-              <w:left w:type="dxa" w:w="100"/>
-              <w:bottom w:type="dxa" w:w="70"/>
+              <w:top w:type="dxa" w:w="45"/>
+              <w:left w:type="dxa" w:w="100"/>
+              <w:bottom w:type="dxa" w:w="45"/>
               <w:right w:type="dxa" w:w="100"/>
             </w:tcMar>
           </w:tcPr>
@@ -3617,9 +3701,9 @@
               <w:right w:val="none" w:color="FFFFFF" w:sz="0"/>
             </w:tcBorders>
             <w:tcMar>
-              <w:top w:type="dxa" w:w="70"/>
-              <w:left w:type="dxa" w:w="100"/>
-              <w:bottom w:type="dxa" w:w="70"/>
+              <w:top w:type="dxa" w:w="45"/>
+              <w:left w:type="dxa" w:w="100"/>
+              <w:bottom w:type="dxa" w:w="45"/>
               <w:right w:type="dxa" w:w="100"/>
             </w:tcMar>
           </w:tcPr>
@@ -3648,9 +3732,9 @@
               <w:right w:val="none" w:color="FFFFFF" w:sz="0"/>
             </w:tcBorders>
             <w:tcMar>
-              <w:top w:type="dxa" w:w="70"/>
-              <w:left w:type="dxa" w:w="100"/>
-              <w:bottom w:type="dxa" w:w="70"/>
+              <w:top w:type="dxa" w:w="45"/>
+              <w:left w:type="dxa" w:w="100"/>
+              <w:bottom w:type="dxa" w:w="45"/>
               <w:right w:type="dxa" w:w="0"/>
             </w:tcMar>
           </w:tcPr>
@@ -3684,9 +3768,9 @@
               <w:right w:val="none" w:color="FFFFFF" w:sz="0"/>
             </w:tcBorders>
             <w:tcMar>
-              <w:top w:type="dxa" w:w="70"/>
+              <w:top w:type="dxa" w:w="45"/>
               <w:left w:type="dxa" w:w="0"/>
-              <w:bottom w:type="dxa" w:w="70"/>
+              <w:bottom w:type="dxa" w:w="45"/>
               <w:right w:type="dxa" w:w="100"/>
             </w:tcMar>
           </w:tcPr>
@@ -3715,9 +3799,9 @@
               <w:right w:val="none" w:color="FFFFFF" w:sz="0"/>
             </w:tcBorders>
             <w:tcMar>
-              <w:top w:type="dxa" w:w="70"/>
-              <w:left w:type="dxa" w:w="100"/>
-              <w:bottom w:type="dxa" w:w="70"/>
+              <w:top w:type="dxa" w:w="45"/>
+              <w:left w:type="dxa" w:w="100"/>
+              <w:bottom w:type="dxa" w:w="45"/>
               <w:right w:type="dxa" w:w="100"/>
             </w:tcMar>
           </w:tcPr>
@@ -3748,9 +3832,9 @@
               <w:right w:val="none" w:color="FFFFFF" w:sz="0"/>
             </w:tcBorders>
             <w:tcMar>
-              <w:top w:type="dxa" w:w="70"/>
-              <w:left w:type="dxa" w:w="100"/>
-              <w:bottom w:type="dxa" w:w="70"/>
+              <w:top w:type="dxa" w:w="45"/>
+              <w:left w:type="dxa" w:w="100"/>
+              <w:bottom w:type="dxa" w:w="45"/>
               <w:right w:type="dxa" w:w="100"/>
             </w:tcMar>
           </w:tcPr>
@@ -3779,9 +3863,9 @@
               <w:right w:val="none" w:color="FFFFFF" w:sz="0"/>
             </w:tcBorders>
             <w:tcMar>
-              <w:top w:type="dxa" w:w="70"/>
-              <w:left w:type="dxa" w:w="100"/>
-              <w:bottom w:type="dxa" w:w="70"/>
+              <w:top w:type="dxa" w:w="45"/>
+              <w:left w:type="dxa" w:w="100"/>
+              <w:bottom w:type="dxa" w:w="45"/>
               <w:right w:type="dxa" w:w="0"/>
             </w:tcMar>
           </w:tcPr>
@@ -3815,9 +3899,9 @@
               <w:right w:val="none" w:color="FFFFFF" w:sz="0"/>
             </w:tcBorders>
             <w:tcMar>
-              <w:top w:type="dxa" w:w="70"/>
+              <w:top w:type="dxa" w:w="45"/>
               <w:left w:type="dxa" w:w="0"/>
-              <w:bottom w:type="dxa" w:w="70"/>
+              <w:bottom w:type="dxa" w:w="45"/>
               <w:right w:type="dxa" w:w="100"/>
             </w:tcMar>
           </w:tcPr>
@@ -3846,9 +3930,9 @@
               <w:right w:val="none" w:color="FFFFFF" w:sz="0"/>
             </w:tcBorders>
             <w:tcMar>
-              <w:top w:type="dxa" w:w="70"/>
-              <w:left w:type="dxa" w:w="100"/>
-              <w:bottom w:type="dxa" w:w="70"/>
+              <w:top w:type="dxa" w:w="45"/>
+              <w:left w:type="dxa" w:w="100"/>
+              <w:bottom w:type="dxa" w:w="45"/>
               <w:right w:type="dxa" w:w="100"/>
             </w:tcMar>
           </w:tcPr>
@@ -3879,9 +3963,9 @@
               <w:right w:val="none" w:color="FFFFFF" w:sz="0"/>
             </w:tcBorders>
             <w:tcMar>
-              <w:top w:type="dxa" w:w="70"/>
-              <w:left w:type="dxa" w:w="100"/>
-              <w:bottom w:type="dxa" w:w="70"/>
+              <w:top w:type="dxa" w:w="45"/>
+              <w:left w:type="dxa" w:w="100"/>
+              <w:bottom w:type="dxa" w:w="45"/>
               <w:right w:type="dxa" w:w="100"/>
             </w:tcMar>
           </w:tcPr>
@@ -3910,9 +3994,9 @@
               <w:right w:val="none" w:color="FFFFFF" w:sz="0"/>
             </w:tcBorders>
             <w:tcMar>
-              <w:top w:type="dxa" w:w="70"/>
-              <w:left w:type="dxa" w:w="100"/>
-              <w:bottom w:type="dxa" w:w="70"/>
+              <w:top w:type="dxa" w:w="45"/>
+              <w:left w:type="dxa" w:w="100"/>
+              <w:bottom w:type="dxa" w:w="45"/>
               <w:right w:type="dxa" w:w="0"/>
             </w:tcMar>
           </w:tcPr>
@@ -3946,9 +4030,9 @@
               <w:right w:val="none" w:color="FFFFFF" w:sz="0"/>
             </w:tcBorders>
             <w:tcMar>
-              <w:top w:type="dxa" w:w="70"/>
+              <w:top w:type="dxa" w:w="45"/>
               <w:left w:type="dxa" w:w="0"/>
-              <w:bottom w:type="dxa" w:w="70"/>
+              <w:bottom w:type="dxa" w:w="45"/>
               <w:right w:type="dxa" w:w="100"/>
             </w:tcMar>
           </w:tcPr>
@@ -3977,9 +4061,9 @@
               <w:right w:val="none" w:color="FFFFFF" w:sz="0"/>
             </w:tcBorders>
             <w:tcMar>
-              <w:top w:type="dxa" w:w="70"/>
-              <w:left w:type="dxa" w:w="100"/>
-              <w:bottom w:type="dxa" w:w="70"/>
+              <w:top w:type="dxa" w:w="45"/>
+              <w:left w:type="dxa" w:w="100"/>
+              <w:bottom w:type="dxa" w:w="45"/>
               <w:right w:type="dxa" w:w="100"/>
             </w:tcMar>
           </w:tcPr>
@@ -4010,9 +4094,9 @@
               <w:right w:val="none" w:color="FFFFFF" w:sz="0"/>
             </w:tcBorders>
             <w:tcMar>
-              <w:top w:type="dxa" w:w="70"/>
-              <w:left w:type="dxa" w:w="100"/>
-              <w:bottom w:type="dxa" w:w="70"/>
+              <w:top w:type="dxa" w:w="45"/>
+              <w:left w:type="dxa" w:w="100"/>
+              <w:bottom w:type="dxa" w:w="45"/>
               <w:right w:type="dxa" w:w="100"/>
             </w:tcMar>
           </w:tcPr>
@@ -4041,9 +4125,9 @@
               <w:right w:val="none" w:color="FFFFFF" w:sz="0"/>
             </w:tcBorders>
             <w:tcMar>
-              <w:top w:type="dxa" w:w="70"/>
-              <w:left w:type="dxa" w:w="100"/>
-              <w:bottom w:type="dxa" w:w="70"/>
+              <w:top w:type="dxa" w:w="45"/>
+              <w:left w:type="dxa" w:w="100"/>
+              <w:bottom w:type="dxa" w:w="45"/>
               <w:right w:type="dxa" w:w="0"/>
             </w:tcMar>
           </w:tcPr>
@@ -4077,9 +4161,9 @@
               <w:right w:val="none" w:color="FFFFFF" w:sz="0"/>
             </w:tcBorders>
             <w:tcMar>
-              <w:top w:type="dxa" w:w="70"/>
+              <w:top w:type="dxa" w:w="45"/>
               <w:left w:type="dxa" w:w="0"/>
-              <w:bottom w:type="dxa" w:w="70"/>
+              <w:bottom w:type="dxa" w:w="45"/>
               <w:right w:type="dxa" w:w="100"/>
             </w:tcMar>
           </w:tcPr>
@@ -4108,9 +4192,9 @@
               <w:right w:val="none" w:color="FFFFFF" w:sz="0"/>
             </w:tcBorders>
             <w:tcMar>
-              <w:top w:type="dxa" w:w="70"/>
-              <w:left w:type="dxa" w:w="100"/>
-              <w:bottom w:type="dxa" w:w="70"/>
+              <w:top w:type="dxa" w:w="45"/>
+              <w:left w:type="dxa" w:w="100"/>
+              <w:bottom w:type="dxa" w:w="45"/>
               <w:right w:type="dxa" w:w="100"/>
             </w:tcMar>
           </w:tcPr>
@@ -4141,9 +4225,9 @@
               <w:right w:val="none" w:color="FFFFFF" w:sz="0"/>
             </w:tcBorders>
             <w:tcMar>
-              <w:top w:type="dxa" w:w="70"/>
-              <w:left w:type="dxa" w:w="100"/>
-              <w:bottom w:type="dxa" w:w="70"/>
+              <w:top w:type="dxa" w:w="45"/>
+              <w:left w:type="dxa" w:w="100"/>
+              <w:bottom w:type="dxa" w:w="45"/>
               <w:right w:type="dxa" w:w="100"/>
             </w:tcMar>
           </w:tcPr>
@@ -4172,9 +4256,9 @@
               <w:right w:val="none" w:color="FFFFFF" w:sz="0"/>
             </w:tcBorders>
             <w:tcMar>
-              <w:top w:type="dxa" w:w="70"/>
-              <w:left w:type="dxa" w:w="100"/>
-              <w:bottom w:type="dxa" w:w="70"/>
+              <w:top w:type="dxa" w:w="45"/>
+              <w:left w:type="dxa" w:w="100"/>
+              <w:bottom w:type="dxa" w:w="45"/>
               <w:right w:type="dxa" w:w="0"/>
             </w:tcMar>
           </w:tcPr>
@@ -4208,9 +4292,9 @@
               <w:right w:val="none" w:color="FFFFFF" w:sz="0"/>
             </w:tcBorders>
             <w:tcMar>
-              <w:top w:type="dxa" w:w="70"/>
+              <w:top w:type="dxa" w:w="45"/>
               <w:left w:type="dxa" w:w="0"/>
-              <w:bottom w:type="dxa" w:w="70"/>
+              <w:bottom w:type="dxa" w:w="45"/>
               <w:right w:type="dxa" w:w="100"/>
             </w:tcMar>
           </w:tcPr>
@@ -4239,9 +4323,9 @@
               <w:right w:val="none" w:color="FFFFFF" w:sz="0"/>
             </w:tcBorders>
             <w:tcMar>
-              <w:top w:type="dxa" w:w="70"/>
-              <w:left w:type="dxa" w:w="100"/>
-              <w:bottom w:type="dxa" w:w="70"/>
+              <w:top w:type="dxa" w:w="45"/>
+              <w:left w:type="dxa" w:w="100"/>
+              <w:bottom w:type="dxa" w:w="45"/>
               <w:right w:type="dxa" w:w="100"/>
             </w:tcMar>
           </w:tcPr>
@@ -4272,9 +4356,9 @@
               <w:right w:val="none" w:color="FFFFFF" w:sz="0"/>
             </w:tcBorders>
             <w:tcMar>
-              <w:top w:type="dxa" w:w="70"/>
-              <w:left w:type="dxa" w:w="100"/>
-              <w:bottom w:type="dxa" w:w="70"/>
+              <w:top w:type="dxa" w:w="45"/>
+              <w:left w:type="dxa" w:w="100"/>
+              <w:bottom w:type="dxa" w:w="45"/>
               <w:right w:type="dxa" w:w="100"/>
             </w:tcMar>
           </w:tcPr>
@@ -4303,9 +4387,9 @@
               <w:right w:val="none" w:color="FFFFFF" w:sz="0"/>
             </w:tcBorders>
             <w:tcMar>
-              <w:top w:type="dxa" w:w="70"/>
-              <w:left w:type="dxa" w:w="100"/>
-              <w:bottom w:type="dxa" w:w="70"/>
+              <w:top w:type="dxa" w:w="45"/>
+              <w:left w:type="dxa" w:w="100"/>
+              <w:bottom w:type="dxa" w:w="45"/>
               <w:right w:type="dxa" w:w="0"/>
             </w:tcMar>
           </w:tcPr>
@@ -4339,9 +4423,9 @@
               <w:right w:val="none" w:color="FFFFFF" w:sz="0"/>
             </w:tcBorders>
             <w:tcMar>
-              <w:top w:type="dxa" w:w="70"/>
+              <w:top w:type="dxa" w:w="45"/>
               <w:left w:type="dxa" w:w="0"/>
-              <w:bottom w:type="dxa" w:w="70"/>
+              <w:bottom w:type="dxa" w:w="45"/>
               <w:right w:type="dxa" w:w="100"/>
             </w:tcMar>
           </w:tcPr>
@@ -4370,9 +4454,9 @@
               <w:right w:val="none" w:color="FFFFFF" w:sz="0"/>
             </w:tcBorders>
             <w:tcMar>
-              <w:top w:type="dxa" w:w="70"/>
-              <w:left w:type="dxa" w:w="100"/>
-              <w:bottom w:type="dxa" w:w="70"/>
+              <w:top w:type="dxa" w:w="45"/>
+              <w:left w:type="dxa" w:w="100"/>
+              <w:bottom w:type="dxa" w:w="45"/>
               <w:right w:type="dxa" w:w="100"/>
             </w:tcMar>
           </w:tcPr>
@@ -4403,9 +4487,9 @@
               <w:right w:val="none" w:color="FFFFFF" w:sz="0"/>
             </w:tcBorders>
             <w:tcMar>
-              <w:top w:type="dxa" w:w="70"/>
-              <w:left w:type="dxa" w:w="100"/>
-              <w:bottom w:type="dxa" w:w="70"/>
+              <w:top w:type="dxa" w:w="45"/>
+              <w:left w:type="dxa" w:w="100"/>
+              <w:bottom w:type="dxa" w:w="45"/>
               <w:right w:type="dxa" w:w="100"/>
             </w:tcMar>
           </w:tcPr>
@@ -4434,9 +4518,9 @@
               <w:right w:val="none" w:color="FFFFFF" w:sz="0"/>
             </w:tcBorders>
             <w:tcMar>
-              <w:top w:type="dxa" w:w="70"/>
-              <w:left w:type="dxa" w:w="100"/>
-              <w:bottom w:type="dxa" w:w="70"/>
+              <w:top w:type="dxa" w:w="45"/>
+              <w:left w:type="dxa" w:w="100"/>
+              <w:bottom w:type="dxa" w:w="45"/>
               <w:right w:type="dxa" w:w="0"/>
             </w:tcMar>
           </w:tcPr>
@@ -4470,9 +4554,9 @@
               <w:right w:val="none" w:color="FFFFFF" w:sz="0"/>
             </w:tcBorders>
             <w:tcMar>
-              <w:top w:type="dxa" w:w="70"/>
+              <w:top w:type="dxa" w:w="45"/>
               <w:left w:type="dxa" w:w="0"/>
-              <w:bottom w:type="dxa" w:w="70"/>
+              <w:bottom w:type="dxa" w:w="45"/>
               <w:right w:type="dxa" w:w="100"/>
             </w:tcMar>
           </w:tcPr>
@@ -4501,9 +4585,9 @@
               <w:right w:val="none" w:color="FFFFFF" w:sz="0"/>
             </w:tcBorders>
             <w:tcMar>
-              <w:top w:type="dxa" w:w="70"/>
-              <w:left w:type="dxa" w:w="100"/>
-              <w:bottom w:type="dxa" w:w="70"/>
+              <w:top w:type="dxa" w:w="45"/>
+              <w:left w:type="dxa" w:w="100"/>
+              <w:bottom w:type="dxa" w:w="45"/>
               <w:right w:type="dxa" w:w="100"/>
             </w:tcMar>
           </w:tcPr>
@@ -4534,9 +4618,9 @@
               <w:right w:val="none" w:color="FFFFFF" w:sz="0"/>
             </w:tcBorders>
             <w:tcMar>
-              <w:top w:type="dxa" w:w="70"/>
-              <w:left w:type="dxa" w:w="100"/>
-              <w:bottom w:type="dxa" w:w="70"/>
+              <w:top w:type="dxa" w:w="45"/>
+              <w:left w:type="dxa" w:w="100"/>
+              <w:bottom w:type="dxa" w:w="45"/>
               <w:right w:type="dxa" w:w="100"/>
             </w:tcMar>
           </w:tcPr>
@@ -4565,9 +4649,9 @@
               <w:right w:val="none" w:color="FFFFFF" w:sz="0"/>
             </w:tcBorders>
             <w:tcMar>
-              <w:top w:type="dxa" w:w="70"/>
-              <w:left w:type="dxa" w:w="100"/>
-              <w:bottom w:type="dxa" w:w="70"/>
+              <w:top w:type="dxa" w:w="45"/>
+              <w:left w:type="dxa" w:w="100"/>
+              <w:bottom w:type="dxa" w:w="45"/>
               <w:right w:type="dxa" w:w="0"/>
             </w:tcMar>
           </w:tcPr>
@@ -4601,9 +4685,9 @@
               <w:right w:val="none" w:color="FFFFFF" w:sz="0"/>
             </w:tcBorders>
             <w:tcMar>
-              <w:top w:type="dxa" w:w="70"/>
+              <w:top w:type="dxa" w:w="45"/>
               <w:left w:type="dxa" w:w="0"/>
-              <w:bottom w:type="dxa" w:w="70"/>
+              <w:bottom w:type="dxa" w:w="45"/>
               <w:right w:type="dxa" w:w="100"/>
             </w:tcMar>
           </w:tcPr>
@@ -4632,9 +4716,9 @@
               <w:right w:val="none" w:color="FFFFFF" w:sz="0"/>
             </w:tcBorders>
             <w:tcMar>
-              <w:top w:type="dxa" w:w="70"/>
-              <w:left w:type="dxa" w:w="100"/>
-              <w:bottom w:type="dxa" w:w="70"/>
+              <w:top w:type="dxa" w:w="45"/>
+              <w:left w:type="dxa" w:w="100"/>
+              <w:bottom w:type="dxa" w:w="45"/>
               <w:right w:type="dxa" w:w="100"/>
             </w:tcMar>
           </w:tcPr>
@@ -4665,9 +4749,9 @@
               <w:right w:val="none" w:color="FFFFFF" w:sz="0"/>
             </w:tcBorders>
             <w:tcMar>
-              <w:top w:type="dxa" w:w="70"/>
-              <w:left w:type="dxa" w:w="100"/>
-              <w:bottom w:type="dxa" w:w="70"/>
+              <w:top w:type="dxa" w:w="45"/>
+              <w:left w:type="dxa" w:w="100"/>
+              <w:bottom w:type="dxa" w:w="45"/>
               <w:right w:type="dxa" w:w="100"/>
             </w:tcMar>
           </w:tcPr>
@@ -4696,9 +4780,9 @@
               <w:right w:val="none" w:color="FFFFFF" w:sz="0"/>
             </w:tcBorders>
             <w:tcMar>
-              <w:top w:type="dxa" w:w="70"/>
-              <w:left w:type="dxa" w:w="100"/>
-              <w:bottom w:type="dxa" w:w="70"/>
+              <w:top w:type="dxa" w:w="45"/>
+              <w:left w:type="dxa" w:w="100"/>
+              <w:bottom w:type="dxa" w:w="45"/>
               <w:right w:type="dxa" w:w="0"/>
             </w:tcMar>
           </w:tcPr>
@@ -4732,9 +4816,9 @@
               <w:right w:val="none" w:color="FFFFFF" w:sz="0"/>
             </w:tcBorders>
             <w:tcMar>
-              <w:top w:type="dxa" w:w="70"/>
+              <w:top w:type="dxa" w:w="45"/>
               <w:left w:type="dxa" w:w="0"/>
-              <w:bottom w:type="dxa" w:w="70"/>
+              <w:bottom w:type="dxa" w:w="45"/>
               <w:right w:type="dxa" w:w="100"/>
             </w:tcMar>
           </w:tcPr>
@@ -4763,9 +4847,9 @@
               <w:right w:val="none" w:color="FFFFFF" w:sz="0"/>
             </w:tcBorders>
             <w:tcMar>
-              <w:top w:type="dxa" w:w="70"/>
-              <w:left w:type="dxa" w:w="100"/>
-              <w:bottom w:type="dxa" w:w="70"/>
+              <w:top w:type="dxa" w:w="45"/>
+              <w:left w:type="dxa" w:w="100"/>
+              <w:bottom w:type="dxa" w:w="45"/>
               <w:right w:type="dxa" w:w="100"/>
             </w:tcMar>
           </w:tcPr>
@@ -4796,9 +4880,9 @@
               <w:right w:val="none" w:color="FFFFFF" w:sz="0"/>
             </w:tcBorders>
             <w:tcMar>
-              <w:top w:type="dxa" w:w="70"/>
-              <w:left w:type="dxa" w:w="100"/>
-              <w:bottom w:type="dxa" w:w="70"/>
+              <w:top w:type="dxa" w:w="45"/>
+              <w:left w:type="dxa" w:w="100"/>
+              <w:bottom w:type="dxa" w:w="45"/>
               <w:right w:type="dxa" w:w="100"/>
             </w:tcMar>
           </w:tcPr>
@@ -4827,9 +4911,9 @@
               <w:right w:val="none" w:color="FFFFFF" w:sz="0"/>
             </w:tcBorders>
             <w:tcMar>
-              <w:top w:type="dxa" w:w="70"/>
-              <w:left w:type="dxa" w:w="100"/>
-              <w:bottom w:type="dxa" w:w="70"/>
+              <w:top w:type="dxa" w:w="45"/>
+              <w:left w:type="dxa" w:w="100"/>
+              <w:bottom w:type="dxa" w:w="45"/>
               <w:right w:type="dxa" w:w="0"/>
             </w:tcMar>
           </w:tcPr>
@@ -4863,9 +4947,9 @@
               <w:right w:val="none" w:color="FFFFFF" w:sz="0"/>
             </w:tcBorders>
             <w:tcMar>
-              <w:top w:type="dxa" w:w="70"/>
+              <w:top w:type="dxa" w:w="45"/>
               <w:left w:type="dxa" w:w="0"/>
-              <w:bottom w:type="dxa" w:w="70"/>
+              <w:bottom w:type="dxa" w:w="45"/>
               <w:right w:type="dxa" w:w="100"/>
             </w:tcMar>
           </w:tcPr>
@@ -4894,9 +4978,9 @@
               <w:right w:val="none" w:color="FFFFFF" w:sz="0"/>
             </w:tcBorders>
             <w:tcMar>
-              <w:top w:type="dxa" w:w="70"/>
-              <w:left w:type="dxa" w:w="100"/>
-              <w:bottom w:type="dxa" w:w="70"/>
+              <w:top w:type="dxa" w:w="45"/>
+              <w:left w:type="dxa" w:w="100"/>
+              <w:bottom w:type="dxa" w:w="45"/>
               <w:right w:type="dxa" w:w="100"/>
             </w:tcMar>
           </w:tcPr>
@@ -4927,9 +5011,9 @@
               <w:right w:val="none" w:color="FFFFFF" w:sz="0"/>
             </w:tcBorders>
             <w:tcMar>
-              <w:top w:type="dxa" w:w="70"/>
-              <w:left w:type="dxa" w:w="100"/>
-              <w:bottom w:type="dxa" w:w="70"/>
+              <w:top w:type="dxa" w:w="45"/>
+              <w:left w:type="dxa" w:w="100"/>
+              <w:bottom w:type="dxa" w:w="45"/>
               <w:right w:type="dxa" w:w="100"/>
             </w:tcMar>
           </w:tcPr>
@@ -4958,9 +5042,9 @@
               <w:right w:val="none" w:color="FFFFFF" w:sz="0"/>
             </w:tcBorders>
             <w:tcMar>
-              <w:top w:type="dxa" w:w="70"/>
-              <w:left w:type="dxa" w:w="100"/>
-              <w:bottom w:type="dxa" w:w="70"/>
+              <w:top w:type="dxa" w:w="45"/>
+              <w:left w:type="dxa" w:w="100"/>
+              <w:bottom w:type="dxa" w:w="45"/>
               <w:right w:type="dxa" w:w="0"/>
             </w:tcMar>
           </w:tcPr>
@@ -4994,9 +5078,9 @@
               <w:right w:val="none" w:color="FFFFFF" w:sz="0"/>
             </w:tcBorders>
             <w:tcMar>
-              <w:top w:type="dxa" w:w="70"/>
+              <w:top w:type="dxa" w:w="45"/>
               <w:left w:type="dxa" w:w="0"/>
-              <w:bottom w:type="dxa" w:w="70"/>
+              <w:bottom w:type="dxa" w:w="45"/>
               <w:right w:type="dxa" w:w="100"/>
             </w:tcMar>
           </w:tcPr>
@@ -5025,9 +5109,9 @@
               <w:right w:val="none" w:color="FFFFFF" w:sz="0"/>
             </w:tcBorders>
             <w:tcMar>
-              <w:top w:type="dxa" w:w="70"/>
-              <w:left w:type="dxa" w:w="100"/>
-              <w:bottom w:type="dxa" w:w="70"/>
+              <w:top w:type="dxa" w:w="45"/>
+              <w:left w:type="dxa" w:w="100"/>
+              <w:bottom w:type="dxa" w:w="45"/>
               <w:right w:type="dxa" w:w="100"/>
             </w:tcMar>
           </w:tcPr>
@@ -5058,9 +5142,9 @@
               <w:right w:val="none" w:color="FFFFFF" w:sz="0"/>
             </w:tcBorders>
             <w:tcMar>
-              <w:top w:type="dxa" w:w="70"/>
-              <w:left w:type="dxa" w:w="100"/>
-              <w:bottom w:type="dxa" w:w="70"/>
+              <w:top w:type="dxa" w:w="45"/>
+              <w:left w:type="dxa" w:w="100"/>
+              <w:bottom w:type="dxa" w:w="45"/>
               <w:right w:type="dxa" w:w="100"/>
             </w:tcMar>
           </w:tcPr>
@@ -5089,9 +5173,9 @@
               <w:right w:val="none" w:color="FFFFFF" w:sz="0"/>
             </w:tcBorders>
             <w:tcMar>
-              <w:top w:type="dxa" w:w="70"/>
-              <w:left w:type="dxa" w:w="100"/>
-              <w:bottom w:type="dxa" w:w="70"/>
+              <w:top w:type="dxa" w:w="45"/>
+              <w:left w:type="dxa" w:w="100"/>
+              <w:bottom w:type="dxa" w:w="45"/>
               <w:right w:type="dxa" w:w="0"/>
             </w:tcMar>
           </w:tcPr>
@@ -5125,9 +5209,9 @@
               <w:right w:val="none" w:color="FFFFFF" w:sz="0"/>
             </w:tcBorders>
             <w:tcMar>
-              <w:top w:type="dxa" w:w="70"/>
+              <w:top w:type="dxa" w:w="45"/>
               <w:left w:type="dxa" w:w="0"/>
-              <w:bottom w:type="dxa" w:w="70"/>
+              <w:bottom w:type="dxa" w:w="45"/>
               <w:right w:type="dxa" w:w="100"/>
             </w:tcMar>
           </w:tcPr>
@@ -5156,9 +5240,9 @@
               <w:right w:val="none" w:color="FFFFFF" w:sz="0"/>
             </w:tcBorders>
             <w:tcMar>
-              <w:top w:type="dxa" w:w="70"/>
-              <w:left w:type="dxa" w:w="100"/>
-              <w:bottom w:type="dxa" w:w="70"/>
+              <w:top w:type="dxa" w:w="45"/>
+              <w:left w:type="dxa" w:w="100"/>
+              <w:bottom w:type="dxa" w:w="45"/>
               <w:right w:type="dxa" w:w="100"/>
             </w:tcMar>
           </w:tcPr>
@@ -5189,9 +5273,9 @@
               <w:right w:val="none" w:color="FFFFFF" w:sz="0"/>
             </w:tcBorders>
             <w:tcMar>
-              <w:top w:type="dxa" w:w="70"/>
-              <w:left w:type="dxa" w:w="100"/>
-              <w:bottom w:type="dxa" w:w="70"/>
+              <w:top w:type="dxa" w:w="45"/>
+              <w:left w:type="dxa" w:w="100"/>
+              <w:bottom w:type="dxa" w:w="45"/>
               <w:right w:type="dxa" w:w="100"/>
             </w:tcMar>
           </w:tcPr>
@@ -5220,9 +5304,9 @@
               <w:right w:val="none" w:color="FFFFFF" w:sz="0"/>
             </w:tcBorders>
             <w:tcMar>
-              <w:top w:type="dxa" w:w="70"/>
-              <w:left w:type="dxa" w:w="100"/>
-              <w:bottom w:type="dxa" w:w="70"/>
+              <w:top w:type="dxa" w:w="45"/>
+              <w:left w:type="dxa" w:w="100"/>
+              <w:bottom w:type="dxa" w:w="45"/>
               <w:right w:type="dxa" w:w="0"/>
             </w:tcMar>
           </w:tcPr>
@@ -5256,9 +5340,9 @@
               <w:right w:val="none" w:color="FFFFFF" w:sz="0"/>
             </w:tcBorders>
             <w:tcMar>
-              <w:top w:type="dxa" w:w="70"/>
+              <w:top w:type="dxa" w:w="45"/>
               <w:left w:type="dxa" w:w="0"/>
-              <w:bottom w:type="dxa" w:w="70"/>
+              <w:bottom w:type="dxa" w:w="45"/>
               <w:right w:type="dxa" w:w="100"/>
             </w:tcMar>
           </w:tcPr>
@@ -5287,9 +5371,9 @@
               <w:right w:val="none" w:color="FFFFFF" w:sz="0"/>
             </w:tcBorders>
             <w:tcMar>
-              <w:top w:type="dxa" w:w="70"/>
-              <w:left w:type="dxa" w:w="100"/>
-              <w:bottom w:type="dxa" w:w="70"/>
+              <w:top w:type="dxa" w:w="45"/>
+              <w:left w:type="dxa" w:w="100"/>
+              <w:bottom w:type="dxa" w:w="45"/>
               <w:right w:type="dxa" w:w="100"/>
             </w:tcMar>
           </w:tcPr>
@@ -5320,24 +5404,24 @@
               <w:right w:val="none" w:color="FFFFFF" w:sz="0"/>
             </w:tcBorders>
             <w:tcMar>
-              <w:top w:type="dxa" w:w="70"/>
-              <w:left w:type="dxa" w:w="100"/>
-              <w:bottom w:type="dxa" w:w="70"/>
-              <w:right w:type="dxa" w:w="100"/>
-            </w:tcMar>
-          </w:tcPr>
-          <w:p>
-            <w:pPr>
-              <w:jc w:val="left"/>
-            </w:pPr>
-            <w:r>
-              <w:rPr>
-                <w:rFonts w:ascii="Roboto Serif" w:cs="Roboto Serif" w:eastAsia="Roboto Serif" w:hAnsi="Roboto Serif"/>
-                <w:color w:val="000000"/>
-                <w:sz w:val="20"/>
-                <w:szCs w:val="20"/>
-              </w:rPr>
-              <w:t xml:space="preserve">MADAME BUTTERFLY: Colonial Slavery &amp; Cultural Sustainability</w:t>
+              <w:top w:type="dxa" w:w="45"/>
+              <w:left w:type="dxa" w:w="100"/>
+              <w:bottom w:type="dxa" w:w="45"/>
+              <w:right w:type="dxa" w:w="100"/>
+            </w:tcMar>
+          </w:tcPr>
+          <w:p>
+            <w:pPr>
+              <w:jc w:val="left"/>
+            </w:pPr>
+            <w:r>
+              <w:rPr>
+                <w:rFonts w:ascii="Roboto Serif" w:cs="Roboto Serif" w:eastAsia="Roboto Serif" w:hAnsi="Roboto Serif"/>
+                <w:color w:val="000000"/>
+                <w:sz w:val="20"/>
+                <w:szCs w:val="20"/>
+              </w:rPr>
+              <w:t xml:space="preserve">Madame Butterfly: Colonial Slavery &amp; Cultural Sustainability</w:t>
             </w:r>
           </w:p>
         </w:tc>
@@ -5351,9 +5435,9 @@
               <w:right w:val="none" w:color="FFFFFF" w:sz="0"/>
             </w:tcBorders>
             <w:tcMar>
-              <w:top w:type="dxa" w:w="70"/>
-              <w:left w:type="dxa" w:w="100"/>
-              <w:bottom w:type="dxa" w:w="70"/>
+              <w:top w:type="dxa" w:w="45"/>
+              <w:left w:type="dxa" w:w="100"/>
+              <w:bottom w:type="dxa" w:w="45"/>
               <w:right w:type="dxa" w:w="0"/>
             </w:tcMar>
           </w:tcPr>
@@ -5387,9 +5471,9 @@
               <w:right w:val="none" w:color="FFFFFF" w:sz="0"/>
             </w:tcBorders>
             <w:tcMar>
-              <w:top w:type="dxa" w:w="70"/>
+              <w:top w:type="dxa" w:w="45"/>
               <w:left w:type="dxa" w:w="0"/>
-              <w:bottom w:type="dxa" w:w="70"/>
+              <w:bottom w:type="dxa" w:w="45"/>
               <w:right w:type="dxa" w:w="100"/>
             </w:tcMar>
           </w:tcPr>
@@ -5418,9 +5502,9 @@
               <w:right w:val="none" w:color="FFFFFF" w:sz="0"/>
             </w:tcBorders>
             <w:tcMar>
-              <w:top w:type="dxa" w:w="70"/>
-              <w:left w:type="dxa" w:w="100"/>
-              <w:bottom w:type="dxa" w:w="70"/>
+              <w:top w:type="dxa" w:w="45"/>
+              <w:left w:type="dxa" w:w="100"/>
+              <w:bottom w:type="dxa" w:w="45"/>
               <w:right w:type="dxa" w:w="100"/>
             </w:tcMar>
           </w:tcPr>
@@ -5451,9 +5535,9 @@
               <w:right w:val="none" w:color="FFFFFF" w:sz="0"/>
             </w:tcBorders>
             <w:tcMar>
-              <w:top w:type="dxa" w:w="70"/>
-              <w:left w:type="dxa" w:w="100"/>
-              <w:bottom w:type="dxa" w:w="70"/>
+              <w:top w:type="dxa" w:w="45"/>
+              <w:left w:type="dxa" w:w="100"/>
+              <w:bottom w:type="dxa" w:w="45"/>
               <w:right w:type="dxa" w:w="100"/>
             </w:tcMar>
           </w:tcPr>
@@ -5482,9 +5566,9 @@
               <w:right w:val="none" w:color="FFFFFF" w:sz="0"/>
             </w:tcBorders>
             <w:tcMar>
-              <w:top w:type="dxa" w:w="70"/>
-              <w:left w:type="dxa" w:w="100"/>
-              <w:bottom w:type="dxa" w:w="70"/>
+              <w:top w:type="dxa" w:w="45"/>
+              <w:left w:type="dxa" w:w="100"/>
+              <w:bottom w:type="dxa" w:w="45"/>
               <w:right w:type="dxa" w:w="0"/>
             </w:tcMar>
           </w:tcPr>
@@ -5518,9 +5602,9 @@
               <w:right w:val="none" w:color="FFFFFF" w:sz="0"/>
             </w:tcBorders>
             <w:tcMar>
-              <w:top w:type="dxa" w:w="70"/>
+              <w:top w:type="dxa" w:w="45"/>
               <w:left w:type="dxa" w:w="0"/>
-              <w:bottom w:type="dxa" w:w="70"/>
+              <w:bottom w:type="dxa" w:w="45"/>
               <w:right w:type="dxa" w:w="100"/>
             </w:tcMar>
           </w:tcPr>
@@ -5549,9 +5633,9 @@
               <w:right w:val="none" w:color="FFFFFF" w:sz="0"/>
             </w:tcBorders>
             <w:tcMar>
-              <w:top w:type="dxa" w:w="70"/>
-              <w:left w:type="dxa" w:w="100"/>
-              <w:bottom w:type="dxa" w:w="70"/>
+              <w:top w:type="dxa" w:w="45"/>
+              <w:left w:type="dxa" w:w="100"/>
+              <w:bottom w:type="dxa" w:w="45"/>
               <w:right w:type="dxa" w:w="100"/>
             </w:tcMar>
           </w:tcPr>
@@ -5582,9 +5666,9 @@
               <w:right w:val="none" w:color="FFFFFF" w:sz="0"/>
             </w:tcBorders>
             <w:tcMar>
-              <w:top w:type="dxa" w:w="70"/>
-              <w:left w:type="dxa" w:w="100"/>
-              <w:bottom w:type="dxa" w:w="70"/>
+              <w:top w:type="dxa" w:w="45"/>
+              <w:left w:type="dxa" w:w="100"/>
+              <w:bottom w:type="dxa" w:w="45"/>
               <w:right w:type="dxa" w:w="100"/>
             </w:tcMar>
           </w:tcPr>
@@ -5613,9 +5697,9 @@
               <w:right w:val="none" w:color="FFFFFF" w:sz="0"/>
             </w:tcBorders>
             <w:tcMar>
-              <w:top w:type="dxa" w:w="70"/>
-              <w:left w:type="dxa" w:w="100"/>
-              <w:bottom w:type="dxa" w:w="70"/>
+              <w:top w:type="dxa" w:w="45"/>
+              <w:left w:type="dxa" w:w="100"/>
+              <w:bottom w:type="dxa" w:w="45"/>
               <w:right w:type="dxa" w:w="0"/>
             </w:tcMar>
           </w:tcPr>
@@ -5649,9 +5733,9 @@
               <w:right w:val="none" w:color="FFFFFF" w:sz="0"/>
             </w:tcBorders>
             <w:tcMar>
-              <w:top w:type="dxa" w:w="70"/>
+              <w:top w:type="dxa" w:w="45"/>
               <w:left w:type="dxa" w:w="0"/>
-              <w:bottom w:type="dxa" w:w="70"/>
+              <w:bottom w:type="dxa" w:w="45"/>
               <w:right w:type="dxa" w:w="100"/>
             </w:tcMar>
           </w:tcPr>
@@ -5680,9 +5764,9 @@
               <w:right w:val="none" w:color="FFFFFF" w:sz="0"/>
             </w:tcBorders>
             <w:tcMar>
-              <w:top w:type="dxa" w:w="70"/>
-              <w:left w:type="dxa" w:w="100"/>
-              <w:bottom w:type="dxa" w:w="70"/>
+              <w:top w:type="dxa" w:w="45"/>
+              <w:left w:type="dxa" w:w="100"/>
+              <w:bottom w:type="dxa" w:w="45"/>
               <w:right w:type="dxa" w:w="100"/>
             </w:tcMar>
           </w:tcPr>
@@ -5713,9 +5797,9 @@
               <w:right w:val="none" w:color="FFFFFF" w:sz="0"/>
             </w:tcBorders>
             <w:tcMar>
-              <w:top w:type="dxa" w:w="70"/>
-              <w:left w:type="dxa" w:w="100"/>
-              <w:bottom w:type="dxa" w:w="70"/>
+              <w:top w:type="dxa" w:w="45"/>
+              <w:left w:type="dxa" w:w="100"/>
+              <w:bottom w:type="dxa" w:w="45"/>
               <w:right w:type="dxa" w:w="100"/>
             </w:tcMar>
           </w:tcPr>
@@ -5744,9 +5828,9 @@
               <w:right w:val="none" w:color="FFFFFF" w:sz="0"/>
             </w:tcBorders>
             <w:tcMar>
-              <w:top w:type="dxa" w:w="70"/>
-              <w:left w:type="dxa" w:w="100"/>
-              <w:bottom w:type="dxa" w:w="70"/>
+              <w:top w:type="dxa" w:w="45"/>
+              <w:left w:type="dxa" w:w="100"/>
+              <w:bottom w:type="dxa" w:w="45"/>
               <w:right w:type="dxa" w:w="0"/>
             </w:tcMar>
           </w:tcPr>
@@ -5780,9 +5864,9 @@
               <w:right w:val="none" w:color="FFFFFF" w:sz="0"/>
             </w:tcBorders>
             <w:tcMar>
-              <w:top w:type="dxa" w:w="70"/>
+              <w:top w:type="dxa" w:w="45"/>
               <w:left w:type="dxa" w:w="0"/>
-              <w:bottom w:type="dxa" w:w="70"/>
+              <w:bottom w:type="dxa" w:w="45"/>
               <w:right w:type="dxa" w:w="100"/>
             </w:tcMar>
           </w:tcPr>
@@ -5811,9 +5895,9 @@
               <w:right w:val="none" w:color="FFFFFF" w:sz="0"/>
             </w:tcBorders>
             <w:tcMar>
-              <w:top w:type="dxa" w:w="70"/>
-              <w:left w:type="dxa" w:w="100"/>
-              <w:bottom w:type="dxa" w:w="70"/>
+              <w:top w:type="dxa" w:w="45"/>
+              <w:left w:type="dxa" w:w="100"/>
+              <w:bottom w:type="dxa" w:w="45"/>
               <w:right w:type="dxa" w:w="100"/>
             </w:tcMar>
           </w:tcPr>
@@ -5844,9 +5928,9 @@
               <w:right w:val="none" w:color="FFFFFF" w:sz="0"/>
             </w:tcBorders>
             <w:tcMar>
-              <w:top w:type="dxa" w:w="70"/>
-              <w:left w:type="dxa" w:w="100"/>
-              <w:bottom w:type="dxa" w:w="70"/>
+              <w:top w:type="dxa" w:w="45"/>
+              <w:left w:type="dxa" w:w="100"/>
+              <w:bottom w:type="dxa" w:w="45"/>
               <w:right w:type="dxa" w:w="100"/>
             </w:tcMar>
           </w:tcPr>
@@ -5875,9 +5959,9 @@
               <w:right w:val="none" w:color="FFFFFF" w:sz="0"/>
             </w:tcBorders>
             <w:tcMar>
-              <w:top w:type="dxa" w:w="70"/>
-              <w:left w:type="dxa" w:w="100"/>
-              <w:bottom w:type="dxa" w:w="70"/>
+              <w:top w:type="dxa" w:w="45"/>
+              <w:left w:type="dxa" w:w="100"/>
+              <w:bottom w:type="dxa" w:w="45"/>
               <w:right w:type="dxa" w:w="0"/>
             </w:tcMar>
           </w:tcPr>
@@ -5911,9 +5995,9 @@
               <w:right w:val="none" w:color="FFFFFF" w:sz="0"/>
             </w:tcBorders>
             <w:tcMar>
-              <w:top w:type="dxa" w:w="70"/>
+              <w:top w:type="dxa" w:w="45"/>
               <w:left w:type="dxa" w:w="0"/>
-              <w:bottom w:type="dxa" w:w="70"/>
+              <w:bottom w:type="dxa" w:w="45"/>
               <w:right w:type="dxa" w:w="100"/>
             </w:tcMar>
           </w:tcPr>
@@ -5942,9 +6026,9 @@
               <w:right w:val="none" w:color="FFFFFF" w:sz="0"/>
             </w:tcBorders>
             <w:tcMar>
-              <w:top w:type="dxa" w:w="70"/>
-              <w:left w:type="dxa" w:w="100"/>
-              <w:bottom w:type="dxa" w:w="70"/>
+              <w:top w:type="dxa" w:w="45"/>
+              <w:left w:type="dxa" w:w="100"/>
+              <w:bottom w:type="dxa" w:w="45"/>
               <w:right w:type="dxa" w:w="100"/>
             </w:tcMar>
           </w:tcPr>
@@ -5975,9 +6059,9 @@
               <w:right w:val="none" w:color="FFFFFF" w:sz="0"/>
             </w:tcBorders>
             <w:tcMar>
-              <w:top w:type="dxa" w:w="70"/>
-              <w:left w:type="dxa" w:w="100"/>
-              <w:bottom w:type="dxa" w:w="70"/>
+              <w:top w:type="dxa" w:w="45"/>
+              <w:left w:type="dxa" w:w="100"/>
+              <w:bottom w:type="dxa" w:w="45"/>
               <w:right w:type="dxa" w:w="100"/>
             </w:tcMar>
           </w:tcPr>
@@ -6006,9 +6090,9 @@
               <w:right w:val="none" w:color="FFFFFF" w:sz="0"/>
             </w:tcBorders>
             <w:tcMar>
-              <w:top w:type="dxa" w:w="70"/>
-              <w:left w:type="dxa" w:w="100"/>
-              <w:bottom w:type="dxa" w:w="70"/>
+              <w:top w:type="dxa" w:w="45"/>
+              <w:left w:type="dxa" w:w="100"/>
+              <w:bottom w:type="dxa" w:w="45"/>
               <w:right w:type="dxa" w:w="0"/>
             </w:tcMar>
           </w:tcPr>
@@ -6042,9 +6126,9 @@
               <w:right w:val="none" w:color="FFFFFF" w:sz="0"/>
             </w:tcBorders>
             <w:tcMar>
-              <w:top w:type="dxa" w:w="70"/>
+              <w:top w:type="dxa" w:w="45"/>
               <w:left w:type="dxa" w:w="0"/>
-              <w:bottom w:type="dxa" w:w="70"/>
+              <w:bottom w:type="dxa" w:w="45"/>
               <w:right w:type="dxa" w:w="100"/>
             </w:tcMar>
           </w:tcPr>
@@ -6073,9 +6157,9 @@
               <w:right w:val="none" w:color="FFFFFF" w:sz="0"/>
             </w:tcBorders>
             <w:tcMar>
-              <w:top w:type="dxa" w:w="70"/>
-              <w:left w:type="dxa" w:w="100"/>
-              <w:bottom w:type="dxa" w:w="70"/>
+              <w:top w:type="dxa" w:w="45"/>
+              <w:left w:type="dxa" w:w="100"/>
+              <w:bottom w:type="dxa" w:w="45"/>
               <w:right w:type="dxa" w:w="100"/>
             </w:tcMar>
           </w:tcPr>
@@ -6106,9 +6190,9 @@
               <w:right w:val="none" w:color="FFFFFF" w:sz="0"/>
             </w:tcBorders>
             <w:tcMar>
-              <w:top w:type="dxa" w:w="70"/>
-              <w:left w:type="dxa" w:w="100"/>
-              <w:bottom w:type="dxa" w:w="70"/>
+              <w:top w:type="dxa" w:w="45"/>
+              <w:left w:type="dxa" w:w="100"/>
+              <w:bottom w:type="dxa" w:w="45"/>
               <w:right w:type="dxa" w:w="100"/>
             </w:tcMar>
           </w:tcPr>
@@ -6137,9 +6221,9 @@
               <w:right w:val="none" w:color="FFFFFF" w:sz="0"/>
             </w:tcBorders>
             <w:tcMar>
-              <w:top w:type="dxa" w:w="70"/>
-              <w:left w:type="dxa" w:w="100"/>
-              <w:bottom w:type="dxa" w:w="70"/>
+              <w:top w:type="dxa" w:w="45"/>
+              <w:left w:type="dxa" w:w="100"/>
+              <w:bottom w:type="dxa" w:w="45"/>
               <w:right w:type="dxa" w:w="0"/>
             </w:tcMar>
           </w:tcPr>
@@ -6173,9 +6257,9 @@
               <w:right w:val="none" w:color="FFFFFF" w:sz="0"/>
             </w:tcBorders>
             <w:tcMar>
-              <w:top w:type="dxa" w:w="70"/>
+              <w:top w:type="dxa" w:w="45"/>
               <w:left w:type="dxa" w:w="0"/>
-              <w:bottom w:type="dxa" w:w="70"/>
+              <w:bottom w:type="dxa" w:w="45"/>
               <w:right w:type="dxa" w:w="100"/>
             </w:tcMar>
           </w:tcPr>
@@ -6204,9 +6288,9 @@
               <w:right w:val="none" w:color="FFFFFF" w:sz="0"/>
             </w:tcBorders>
             <w:tcMar>
-              <w:top w:type="dxa" w:w="70"/>
-              <w:left w:type="dxa" w:w="100"/>
-              <w:bottom w:type="dxa" w:w="70"/>
+              <w:top w:type="dxa" w:w="45"/>
+              <w:left w:type="dxa" w:w="100"/>
+              <w:bottom w:type="dxa" w:w="45"/>
               <w:right w:type="dxa" w:w="100"/>
             </w:tcMar>
           </w:tcPr>
@@ -6237,9 +6321,9 @@
               <w:right w:val="none" w:color="FFFFFF" w:sz="0"/>
             </w:tcBorders>
             <w:tcMar>
-              <w:top w:type="dxa" w:w="70"/>
-              <w:left w:type="dxa" w:w="100"/>
-              <w:bottom w:type="dxa" w:w="70"/>
+              <w:top w:type="dxa" w:w="45"/>
+              <w:left w:type="dxa" w:w="100"/>
+              <w:bottom w:type="dxa" w:w="45"/>
               <w:right w:type="dxa" w:w="100"/>
             </w:tcMar>
           </w:tcPr>
@@ -6268,9 +6352,9 @@
               <w:right w:val="none" w:color="FFFFFF" w:sz="0"/>
             </w:tcBorders>
             <w:tcMar>
-              <w:top w:type="dxa" w:w="70"/>
-              <w:left w:type="dxa" w:w="100"/>
-              <w:bottom w:type="dxa" w:w="70"/>
+              <w:top w:type="dxa" w:w="45"/>
+              <w:left w:type="dxa" w:w="100"/>
+              <w:bottom w:type="dxa" w:w="45"/>
               <w:right w:type="dxa" w:w="0"/>
             </w:tcMar>
           </w:tcPr>
@@ -6304,9 +6388,9 @@
               <w:right w:val="none" w:color="FFFFFF" w:sz="0"/>
             </w:tcBorders>
             <w:tcMar>
-              <w:top w:type="dxa" w:w="70"/>
+              <w:top w:type="dxa" w:w="45"/>
               <w:left w:type="dxa" w:w="0"/>
-              <w:bottom w:type="dxa" w:w="70"/>
+              <w:bottom w:type="dxa" w:w="45"/>
               <w:right w:type="dxa" w:w="100"/>
             </w:tcMar>
           </w:tcPr>
@@ -6335,9 +6419,9 @@
               <w:right w:val="none" w:color="FFFFFF" w:sz="0"/>
             </w:tcBorders>
             <w:tcMar>
-              <w:top w:type="dxa" w:w="70"/>
-              <w:left w:type="dxa" w:w="100"/>
-              <w:bottom w:type="dxa" w:w="70"/>
+              <w:top w:type="dxa" w:w="45"/>
+              <w:left w:type="dxa" w:w="100"/>
+              <w:bottom w:type="dxa" w:w="45"/>
               <w:right w:type="dxa" w:w="100"/>
             </w:tcMar>
           </w:tcPr>
@@ -6368,9 +6452,9 @@
               <w:right w:val="none" w:color="FFFFFF" w:sz="0"/>
             </w:tcBorders>
             <w:tcMar>
-              <w:top w:type="dxa" w:w="70"/>
-              <w:left w:type="dxa" w:w="100"/>
-              <w:bottom w:type="dxa" w:w="70"/>
+              <w:top w:type="dxa" w:w="45"/>
+              <w:left w:type="dxa" w:w="100"/>
+              <w:bottom w:type="dxa" w:w="45"/>
               <w:right w:type="dxa" w:w="100"/>
             </w:tcMar>
           </w:tcPr>
@@ -6399,9 +6483,9 @@
               <w:right w:val="none" w:color="FFFFFF" w:sz="0"/>
             </w:tcBorders>
             <w:tcMar>
-              <w:top w:type="dxa" w:w="70"/>
-              <w:left w:type="dxa" w:w="100"/>
-              <w:bottom w:type="dxa" w:w="70"/>
+              <w:top w:type="dxa" w:w="45"/>
+              <w:left w:type="dxa" w:w="100"/>
+              <w:bottom w:type="dxa" w:w="45"/>
               <w:right w:type="dxa" w:w="0"/>
             </w:tcMar>
           </w:tcPr>
@@ -6425,7 +6509,7 @@
     <w:p>
       <w:pPr>
         <w:keepNext/>
-        <w:spacing w:after="160" w:before="360" w:line="336"/>
+        <w:spacing w:after="120" w:before="280" w:line="336"/>
       </w:pPr>
       <w:r>
         <w:rPr>
@@ -6436,7 +6520,7 @@
           <w:sz w:val="26"/>
           <w:szCs w:val="26"/>
         </w:rPr>
-        <w:t xml:space="preserve">02</w:t>
+        <w:t xml:space="preserve">04</w:t>
       </w:r>
       <w:r>
         <w:rPr>

</xml_diff>

<commit_message>
Use the Curriculog proposal tags in the September 29 agenda
The proposal table labels each course with its Curriculog tag (GEOC
Rev/Recert, GEOC NEW, Non-GEOC Rev) under the column heading "Type of
proposal", and the section 03 count uses the same tags.
</commit_message>
<xml_diff>
--- a/committee/ccc/agendas/2026-09-29-agenda.docx
+++ b/committee/ccc/agendas/2026-09-29-agenda.docx
@@ -289,7 +289,7 @@
         </w:rPr>
         <w:t xml:space="preserve">Zoom  </w:t>
       </w:r>
-      <w:hyperlink w:history="1" r:id="rIdsjrfh7sw6kc3gxeg7o3b4">
+      <w:hyperlink w:history="1" r:id="rIdx9lau1tpkrrllciwbqgsj">
         <w:r>
           <w:rPr>
             <w:rFonts w:ascii="Montserrat" w:cs="Montserrat" w:eastAsia="Montserrat" w:hAnsi="Montserrat"/>
@@ -315,7 +315,7 @@
         </w:rPr>
         <w:t xml:space="preserve">Committee page  </w:t>
       </w:r>
-      <w:hyperlink w:history="1" r:id="rId3a5tef5zi0ocx0fm6-dhz">
+      <w:hyperlink w:history="1" r:id="rIdbm1ygutclfqaytyczhfgu">
         <w:r>
           <w:rPr>
             <w:rFonts w:ascii="Montserrat" w:cs="Montserrat" w:eastAsia="Montserrat" w:hAnsi="Montserrat"/>
@@ -451,7 +451,7 @@
           <w:sz w:val="23"/>
           <w:szCs w:val="23"/>
         </w:rPr>
-        <w:t xml:space="preserve">45 course proposals for the 2027–2028 catalog, by Curriculog form: GEOC revision and recertification (26), GEOC new (6), and non-GEOC revision (13).</w:t>
+        <w:t xml:space="preserve">45 course proposals for the 2027–2028 catalog: GEOC Rev/Recert (26), GEOC NEW (6), and Non-GEOC Rev (13).</w:t>
       </w:r>
     </w:p>
     <w:tbl>
@@ -605,7 +605,7 @@
                 <w:sz w:val="17"/>
                 <w:szCs w:val="17"/>
               </w:rPr>
-              <w:t xml:space="preserve">Curriculog form</w:t>
+              <w:t xml:space="preserve">Type of proposal</w:t>
             </w:r>
           </w:p>
         </w:tc>
@@ -736,7 +736,7 @@
                 <w:sz w:val="17"/>
                 <w:szCs w:val="17"/>
               </w:rPr>
-              <w:t xml:space="preserve">GEOC rev/recert</w:t>
+              <w:t xml:space="preserve">GEOC Rev/Recert</w:t>
             </w:r>
           </w:p>
         </w:tc>
@@ -867,7 +867,7 @@
                 <w:sz w:val="17"/>
                 <w:szCs w:val="17"/>
               </w:rPr>
-              <w:t xml:space="preserve">GEOC rev/recert</w:t>
+              <w:t xml:space="preserve">GEOC Rev/Recert</w:t>
             </w:r>
           </w:p>
         </w:tc>
@@ -998,7 +998,7 @@
                 <w:sz w:val="17"/>
                 <w:szCs w:val="17"/>
               </w:rPr>
-              <w:t xml:space="preserve">GEOC rev/recert</w:t>
+              <w:t xml:space="preserve">GEOC Rev/Recert</w:t>
             </w:r>
           </w:p>
         </w:tc>
@@ -1129,7 +1129,7 @@
                 <w:sz w:val="17"/>
                 <w:szCs w:val="17"/>
               </w:rPr>
-              <w:t xml:space="preserve">Non-GEOC rev</w:t>
+              <w:t xml:space="preserve">Non-GEOC Rev</w:t>
             </w:r>
           </w:p>
         </w:tc>
@@ -1260,7 +1260,7 @@
                 <w:sz w:val="17"/>
                 <w:szCs w:val="17"/>
               </w:rPr>
-              <w:t xml:space="preserve">Non-GEOC rev</w:t>
+              <w:t xml:space="preserve">Non-GEOC Rev</w:t>
             </w:r>
           </w:p>
         </w:tc>
@@ -1391,7 +1391,7 @@
                 <w:sz w:val="17"/>
                 <w:szCs w:val="17"/>
               </w:rPr>
-              <w:t xml:space="preserve">Non-GEOC rev</w:t>
+              <w:t xml:space="preserve">Non-GEOC Rev</w:t>
             </w:r>
           </w:p>
         </w:tc>
@@ -1522,7 +1522,7 @@
                 <w:sz w:val="17"/>
                 <w:szCs w:val="17"/>
               </w:rPr>
-              <w:t xml:space="preserve">Non-GEOC rev</w:t>
+              <w:t xml:space="preserve">Non-GEOC Rev</w:t>
             </w:r>
           </w:p>
         </w:tc>
@@ -1653,7 +1653,7 @@
                 <w:sz w:val="17"/>
                 <w:szCs w:val="17"/>
               </w:rPr>
-              <w:t xml:space="preserve">Non-GEOC rev</w:t>
+              <w:t xml:space="preserve">Non-GEOC Rev</w:t>
             </w:r>
           </w:p>
         </w:tc>
@@ -1784,7 +1784,7 @@
                 <w:sz w:val="17"/>
                 <w:szCs w:val="17"/>
               </w:rPr>
-              <w:t xml:space="preserve">GEOC rev/recert</w:t>
+              <w:t xml:space="preserve">GEOC Rev/Recert</w:t>
             </w:r>
           </w:p>
         </w:tc>
@@ -1915,7 +1915,7 @@
                 <w:sz w:val="17"/>
                 <w:szCs w:val="17"/>
               </w:rPr>
-              <w:t xml:space="preserve">Non-GEOC rev</w:t>
+              <w:t xml:space="preserve">Non-GEOC Rev</w:t>
             </w:r>
           </w:p>
         </w:tc>
@@ -2046,7 +2046,7 @@
                 <w:sz w:val="17"/>
                 <w:szCs w:val="17"/>
               </w:rPr>
-              <w:t xml:space="preserve">GEOC rev/recert</w:t>
+              <w:t xml:space="preserve">GEOC Rev/Recert</w:t>
             </w:r>
           </w:p>
         </w:tc>
@@ -2177,7 +2177,7 @@
                 <w:sz w:val="17"/>
                 <w:szCs w:val="17"/>
               </w:rPr>
-              <w:t xml:space="preserve">Non-GEOC rev</w:t>
+              <w:t xml:space="preserve">Non-GEOC Rev</w:t>
             </w:r>
           </w:p>
         </w:tc>
@@ -2308,7 +2308,7 @@
                 <w:sz w:val="17"/>
                 <w:szCs w:val="17"/>
               </w:rPr>
-              <w:t xml:space="preserve">GEOC rev/recert</w:t>
+              <w:t xml:space="preserve">GEOC Rev/Recert</w:t>
             </w:r>
           </w:p>
         </w:tc>
@@ -2439,7 +2439,7 @@
                 <w:sz w:val="17"/>
                 <w:szCs w:val="17"/>
               </w:rPr>
-              <w:t xml:space="preserve">Non-GEOC rev</w:t>
+              <w:t xml:space="preserve">Non-GEOC Rev</w:t>
             </w:r>
           </w:p>
         </w:tc>
@@ -2570,7 +2570,7 @@
                 <w:sz w:val="17"/>
                 <w:szCs w:val="17"/>
               </w:rPr>
-              <w:t xml:space="preserve">Non-GEOC rev</w:t>
+              <w:t xml:space="preserve">Non-GEOC Rev</w:t>
             </w:r>
           </w:p>
         </w:tc>
@@ -2701,7 +2701,7 @@
                 <w:sz w:val="17"/>
                 <w:szCs w:val="17"/>
               </w:rPr>
-              <w:t xml:space="preserve">GEOC rev/recert</w:t>
+              <w:t xml:space="preserve">GEOC Rev/Recert</w:t>
             </w:r>
           </w:p>
         </w:tc>
@@ -2832,7 +2832,7 @@
                 <w:sz w:val="17"/>
                 <w:szCs w:val="17"/>
               </w:rPr>
-              <w:t xml:space="preserve">GEOC rev/recert</w:t>
+              <w:t xml:space="preserve">GEOC Rev/Recert</w:t>
             </w:r>
           </w:p>
         </w:tc>
@@ -2963,7 +2963,7 @@
                 <w:sz w:val="17"/>
                 <w:szCs w:val="17"/>
               </w:rPr>
-              <w:t xml:space="preserve">GEOC rev/recert</w:t>
+              <w:t xml:space="preserve">GEOC Rev/Recert</w:t>
             </w:r>
           </w:p>
         </w:tc>
@@ -3094,7 +3094,7 @@
                 <w:sz w:val="17"/>
                 <w:szCs w:val="17"/>
               </w:rPr>
-              <w:t xml:space="preserve">GEOC rev/recert</w:t>
+              <w:t xml:space="preserve">GEOC Rev/Recert</w:t>
             </w:r>
           </w:p>
         </w:tc>
@@ -3225,7 +3225,7 @@
                 <w:sz w:val="17"/>
                 <w:szCs w:val="17"/>
               </w:rPr>
-              <w:t xml:space="preserve">GEOC rev/recert</w:t>
+              <w:t xml:space="preserve">GEOC Rev/Recert</w:t>
             </w:r>
           </w:p>
         </w:tc>
@@ -3356,7 +3356,7 @@
                 <w:sz w:val="17"/>
                 <w:szCs w:val="17"/>
               </w:rPr>
-              <w:t xml:space="preserve">GEOC rev/recert</w:t>
+              <w:t xml:space="preserve">GEOC Rev/Recert</w:t>
             </w:r>
           </w:p>
         </w:tc>
@@ -3487,7 +3487,7 @@
                 <w:sz w:val="17"/>
                 <w:szCs w:val="17"/>
               </w:rPr>
-              <w:t xml:space="preserve">GEOC rev/recert</w:t>
+              <w:t xml:space="preserve">GEOC Rev/Recert</w:t>
             </w:r>
           </w:p>
         </w:tc>
@@ -3618,7 +3618,7 @@
                 <w:sz w:val="17"/>
                 <w:szCs w:val="17"/>
               </w:rPr>
-              <w:t xml:space="preserve">GEOC rev/recert</w:t>
+              <w:t xml:space="preserve">GEOC Rev/Recert</w:t>
             </w:r>
           </w:p>
         </w:tc>
@@ -3749,7 +3749,7 @@
                 <w:sz w:val="17"/>
                 <w:szCs w:val="17"/>
               </w:rPr>
-              <w:t xml:space="preserve">Non-GEOC rev</w:t>
+              <w:t xml:space="preserve">Non-GEOC Rev</w:t>
             </w:r>
           </w:p>
         </w:tc>
@@ -3880,7 +3880,7 @@
                 <w:sz w:val="17"/>
                 <w:szCs w:val="17"/>
               </w:rPr>
-              <w:t xml:space="preserve">GEOC rev/recert</w:t>
+              <w:t xml:space="preserve">GEOC Rev/Recert</w:t>
             </w:r>
           </w:p>
         </w:tc>
@@ -4011,7 +4011,7 @@
                 <w:sz w:val="17"/>
                 <w:szCs w:val="17"/>
               </w:rPr>
-              <w:t xml:space="preserve">GEOC rev/recert</w:t>
+              <w:t xml:space="preserve">GEOC Rev/Recert</w:t>
             </w:r>
           </w:p>
         </w:tc>
@@ -4142,7 +4142,7 @@
                 <w:sz w:val="17"/>
                 <w:szCs w:val="17"/>
               </w:rPr>
-              <w:t xml:space="preserve">GEOC rev/recert</w:t>
+              <w:t xml:space="preserve">GEOC Rev/Recert</w:t>
             </w:r>
           </w:p>
         </w:tc>
@@ -4273,7 +4273,7 @@
                 <w:sz w:val="17"/>
                 <w:szCs w:val="17"/>
               </w:rPr>
-              <w:t xml:space="preserve">GEOC new</w:t>
+              <w:t xml:space="preserve">GEOC NEW</w:t>
             </w:r>
           </w:p>
         </w:tc>
@@ -4404,7 +4404,7 @@
                 <w:sz w:val="17"/>
                 <w:szCs w:val="17"/>
               </w:rPr>
-              <w:t xml:space="preserve">GEOC rev/recert</w:t>
+              <w:t xml:space="preserve">GEOC Rev/Recert</w:t>
             </w:r>
           </w:p>
         </w:tc>
@@ -4535,7 +4535,7 @@
                 <w:sz w:val="17"/>
                 <w:szCs w:val="17"/>
               </w:rPr>
-              <w:t xml:space="preserve">GEOC new</w:t>
+              <w:t xml:space="preserve">GEOC NEW</w:t>
             </w:r>
           </w:p>
         </w:tc>
@@ -4666,7 +4666,7 @@
                 <w:sz w:val="17"/>
                 <w:szCs w:val="17"/>
               </w:rPr>
-              <w:t xml:space="preserve">Non-GEOC rev</w:t>
+              <w:t xml:space="preserve">Non-GEOC Rev</w:t>
             </w:r>
           </w:p>
         </w:tc>
@@ -4797,7 +4797,7 @@
                 <w:sz w:val="17"/>
                 <w:szCs w:val="17"/>
               </w:rPr>
-              <w:t xml:space="preserve">GEOC new</w:t>
+              <w:t xml:space="preserve">GEOC NEW</w:t>
             </w:r>
           </w:p>
         </w:tc>
@@ -4928,7 +4928,7 @@
                 <w:sz w:val="17"/>
                 <w:szCs w:val="17"/>
               </w:rPr>
-              <w:t xml:space="preserve">GEOC rev/recert</w:t>
+              <w:t xml:space="preserve">GEOC Rev/Recert</w:t>
             </w:r>
           </w:p>
         </w:tc>
@@ -5059,7 +5059,7 @@
                 <w:sz w:val="17"/>
                 <w:szCs w:val="17"/>
               </w:rPr>
-              <w:t xml:space="preserve">Non-GEOC rev</w:t>
+              <w:t xml:space="preserve">Non-GEOC Rev</w:t>
             </w:r>
           </w:p>
         </w:tc>
@@ -5190,7 +5190,7 @@
                 <w:sz w:val="17"/>
                 <w:szCs w:val="17"/>
               </w:rPr>
-              <w:t xml:space="preserve">GEOC rev/recert</w:t>
+              <w:t xml:space="preserve">GEOC Rev/Recert</w:t>
             </w:r>
           </w:p>
         </w:tc>
@@ -5321,7 +5321,7 @@
                 <w:sz w:val="17"/>
                 <w:szCs w:val="17"/>
               </w:rPr>
-              <w:t xml:space="preserve">GEOC rev/recert</w:t>
+              <w:t xml:space="preserve">GEOC Rev/Recert</w:t>
             </w:r>
           </w:p>
         </w:tc>
@@ -5452,7 +5452,7 @@
                 <w:sz w:val="17"/>
                 <w:szCs w:val="17"/>
               </w:rPr>
-              <w:t xml:space="preserve">GEOC new</w:t>
+              <w:t xml:space="preserve">GEOC NEW</w:t>
             </w:r>
           </w:p>
         </w:tc>
@@ -5583,7 +5583,7 @@
                 <w:sz w:val="17"/>
                 <w:szCs w:val="17"/>
               </w:rPr>
-              <w:t xml:space="preserve">Non-GEOC rev</w:t>
+              <w:t xml:space="preserve">Non-GEOC Rev</w:t>
             </w:r>
           </w:p>
         </w:tc>
@@ -5714,7 +5714,7 @@
                 <w:sz w:val="17"/>
                 <w:szCs w:val="17"/>
               </w:rPr>
-              <w:t xml:space="preserve">GEOC rev/recert</w:t>
+              <w:t xml:space="preserve">GEOC Rev/Recert</w:t>
             </w:r>
           </w:p>
         </w:tc>
@@ -5845,7 +5845,7 @@
                 <w:sz w:val="17"/>
                 <w:szCs w:val="17"/>
               </w:rPr>
-              <w:t xml:space="preserve">GEOC new</w:t>
+              <w:t xml:space="preserve">GEOC NEW</w:t>
             </w:r>
           </w:p>
         </w:tc>
@@ -5976,7 +5976,7 @@
                 <w:sz w:val="17"/>
                 <w:szCs w:val="17"/>
               </w:rPr>
-              <w:t xml:space="preserve">GEOC new</w:t>
+              <w:t xml:space="preserve">GEOC NEW</w:t>
             </w:r>
           </w:p>
         </w:tc>
@@ -6107,7 +6107,7 @@
                 <w:sz w:val="17"/>
                 <w:szCs w:val="17"/>
               </w:rPr>
-              <w:t xml:space="preserve">GEOC rev/recert</w:t>
+              <w:t xml:space="preserve">GEOC Rev/Recert</w:t>
             </w:r>
           </w:p>
         </w:tc>
@@ -6238,7 +6238,7 @@
                 <w:sz w:val="17"/>
                 <w:szCs w:val="17"/>
               </w:rPr>
-              <w:t xml:space="preserve">GEOC rev/recert</w:t>
+              <w:t xml:space="preserve">GEOC Rev/Recert</w:t>
             </w:r>
           </w:p>
         </w:tc>
@@ -6369,7 +6369,7 @@
                 <w:sz w:val="17"/>
                 <w:szCs w:val="17"/>
               </w:rPr>
-              <w:t xml:space="preserve">GEOC rev/recert</w:t>
+              <w:t xml:space="preserve">GEOC Rev/Recert</w:t>
             </w:r>
           </w:p>
         </w:tc>
@@ -6500,7 +6500,7 @@
                 <w:sz w:val="17"/>
                 <w:szCs w:val="17"/>
               </w:rPr>
-              <w:t xml:space="preserve">GEOC rev/recert</w:t>
+              <w:t xml:space="preserve">GEOC Rev/Recert</w:t>
             </w:r>
           </w:p>
         </w:tc>

</xml_diff>